<commit_message>
edited test for domain derivatives
edited validation for base flow solution
</commit_message>
<xml_diff>
--- a/tests/stability_analysis_tests.docx
+++ b/tests/stability_analysis_tests.docx
@@ -1,6 +1,6 @@
 
 <file path=word/document.xml><?xml version="1.0" encoding="utf-8"?>
-<w:document xmlns:wpc="http://schemas.microsoft.com/office/word/2010/wordprocessingCanvas" xmlns:cx="http://schemas.microsoft.com/office/drawing/2014/chartex" xmlns:cx1="http://schemas.microsoft.com/office/drawing/2015/9/8/chartex" xmlns:cx2="http://schemas.microsoft.com/office/drawing/2015/10/21/chartex" xmlns:cx3="http://schemas.microsoft.com/office/drawing/2016/5/9/chartex" xmlns:cx4="http://schemas.microsoft.com/office/drawing/2016/5/10/chartex" xmlns:cx5="http://schemas.microsoft.com/office/drawing/2016/5/11/chartex" xmlns:cx6="http://schemas.microsoft.com/office/drawing/2016/5/12/chartex" xmlns:cx7="http://schemas.microsoft.com/office/drawing/2016/5/13/chartex" xmlns:cx8="http://schemas.microsoft.com/office/drawing/2016/5/14/chartex" xmlns:mc="http://schemas.openxmlformats.org/markup-compatibility/2006" xmlns:aink="http://schemas.microsoft.com/office/drawing/2016/ink" xmlns:am3d="http://schemas.microsoft.com/office/drawing/2017/model3d" xmlns:o="urn:schemas-microsoft-com:office:office" xmlns:oel="http://schemas.microsoft.com/office/2019/extlst" xmlns:r="http://schemas.openxmlformats.org/officeDocument/2006/relationships" xmlns:m="http://schemas.openxmlformats.org/officeDocument/2006/math" xmlns:v="urn:schemas-microsoft-com:vml" xmlns:wp14="http://schemas.microsoft.com/office/word/2010/wordprocessingDrawing" xmlns:wp="http://schemas.openxmlformats.org/drawingml/2006/wordprocessingDrawing" xmlns:w10="urn:schemas-microsoft-com:office:word" xmlns:w="http://schemas.openxmlformats.org/wordprocessingml/2006/main" xmlns:w14="http://schemas.microsoft.com/office/word/2010/wordml" xmlns:w15="http://schemas.microsoft.com/office/word/2012/wordml" xmlns:w16cex="http://schemas.microsoft.com/office/word/2018/wordml/cex" xmlns:w16cid="http://schemas.microsoft.com/office/word/2016/wordml/cid" xmlns:w16="http://schemas.microsoft.com/office/word/2018/wordml" xmlns:w16du="http://schemas.microsoft.com/office/word/2023/wordml/word16du" xmlns:w16sdtdh="http://schemas.microsoft.com/office/word/2020/wordml/sdtdatahash" xmlns:w16se="http://schemas.microsoft.com/office/word/2015/wordml/symex" xmlns:wpg="http://schemas.microsoft.com/office/word/2010/wordprocessingGroup" xmlns:wpi="http://schemas.microsoft.com/office/word/2010/wordprocessingInk" xmlns:wne="http://schemas.microsoft.com/office/word/2006/wordml" xmlns:wps="http://schemas.microsoft.com/office/word/2010/wordprocessingShape" mc:Ignorable="w14 w15 w16se w16cid w16 w16cex w16sdtdh w16du wp14">
+<w:document xmlns:wpc="http://schemas.microsoft.com/office/word/2010/wordprocessingCanvas" xmlns:cx="http://schemas.microsoft.com/office/drawing/2014/chartex" xmlns:cx1="http://schemas.microsoft.com/office/drawing/2015/9/8/chartex" xmlns:cx2="http://schemas.microsoft.com/office/drawing/2015/10/21/chartex" xmlns:cx3="http://schemas.microsoft.com/office/drawing/2016/5/9/chartex" xmlns:cx4="http://schemas.microsoft.com/office/drawing/2016/5/10/chartex" xmlns:cx5="http://schemas.microsoft.com/office/drawing/2016/5/11/chartex" xmlns:cx6="http://schemas.microsoft.com/office/drawing/2016/5/12/chartex" xmlns:cx7="http://schemas.microsoft.com/office/drawing/2016/5/13/chartex" xmlns:cx8="http://schemas.microsoft.com/office/drawing/2016/5/14/chartex" xmlns:mc="http://schemas.openxmlformats.org/markup-compatibility/2006" xmlns:aink="http://schemas.microsoft.com/office/drawing/2016/ink" xmlns:am3d="http://schemas.microsoft.com/office/drawing/2017/model3d" xmlns:o="urn:schemas-microsoft-com:office:office" xmlns:oel="http://schemas.microsoft.com/office/2019/extlst" xmlns:r="http://schemas.openxmlformats.org/officeDocument/2006/relationships" xmlns:m="http://schemas.openxmlformats.org/officeDocument/2006/math" xmlns:v="urn:schemas-microsoft-com:vml" xmlns:wp14="http://schemas.microsoft.com/office/word/2010/wordprocessingDrawing" xmlns:wp="http://schemas.openxmlformats.org/drawingml/2006/wordprocessingDrawing" xmlns:w10="urn:schemas-microsoft-com:office:word" xmlns:w="http://schemas.openxmlformats.org/wordprocessingml/2006/main" xmlns:w14="http://schemas.microsoft.com/office/word/2010/wordml" xmlns:w15="http://schemas.microsoft.com/office/word/2012/wordml" xmlns:w16cex="http://schemas.microsoft.com/office/word/2018/wordml/cex" xmlns:w16cid="http://schemas.microsoft.com/office/word/2016/wordml/cid" xmlns:w16="http://schemas.microsoft.com/office/word/2018/wordml" xmlns:w16du="http://schemas.microsoft.com/office/word/2023/wordml/word16du" xmlns:w16sdtdh="http://schemas.microsoft.com/office/word/2020/wordml/sdtdatahash" xmlns:w16sdtfl="http://schemas.microsoft.com/office/word/2024/wordml/sdtformatlock" xmlns:w16se="http://schemas.microsoft.com/office/word/2015/wordml/symex" xmlns:wpg="http://schemas.microsoft.com/office/word/2010/wordprocessingGroup" xmlns:wpi="http://schemas.microsoft.com/office/word/2010/wordprocessingInk" xmlns:wne="http://schemas.microsoft.com/office/word/2006/wordml" xmlns:wps="http://schemas.microsoft.com/office/word/2010/wordprocessingShape" mc:Ignorable="w14 w15 w16se w16cid w16 w16cex w16sdtdh w16sdtfl w16du wp14">
   <w:body>
     <w:p>
       <w:pPr>
@@ -836,14 +836,22 @@
                   <v:path o:extrusionok="f" gradientshapeok="t" o:connecttype="rect"/>
                   <o:lock v:ext="edit" aspectratio="t"/>
                 </v:shapetype>
-                <v:shape id="_x0000_i1325" type="#_x0000_t75" style="width:45.95pt;height:37.25pt" o:ole="">
-                  <v:imagedata r:id="rId5" o:title=""/>
+                <v:shape id="_x0000_i1025" type="#_x0000_t75" style="width:46.2pt;height:37.35pt" o:ole="">
+                  <v:imagedata r:id="rId6" o:title=""/>
                 </v:shape>
-                <o:OLEObject Type="Embed" ProgID="Equation.DSMT4" ShapeID="_x0000_i1325" DrawAspect="Content" ObjectID="_1777568602" r:id="rId6"/>
+                <o:OLEObject Type="Embed" ProgID="Equation.DSMT4" ShapeID="_x0000_i1025" DrawAspect="Content" ObjectID="_1806239239" r:id="rId7"/>
               </w:object>
             </w:r>
             <w:r>
-              <w:t>, for all disturbance components.</w:t>
+              <w:t xml:space="preserve">, </w:t>
+            </w:r>
+            <w:proofErr w:type="gramStart"/>
+            <w:r>
+              <w:t>for</w:t>
+            </w:r>
+            <w:proofErr w:type="gramEnd"/>
+            <w:r>
+              <w:t xml:space="preserve"> all disturbance components.</w:t>
             </w:r>
           </w:p>
         </w:tc>
@@ -937,10 +945,10 @@
                 <w:position w:val="-34"/>
               </w:rPr>
               <w:object w:dxaOrig="4700" w:dyaOrig="780" w14:anchorId="773A852C">
-                <v:shape id="_x0000_i1326" type="#_x0000_t75" style="width:198.6pt;height:32.3pt" o:ole="">
-                  <v:imagedata r:id="rId7" o:title=""/>
+                <v:shape id="_x0000_i1026" type="#_x0000_t75" style="width:198.35pt;height:32.6pt" o:ole="">
+                  <v:imagedata r:id="rId8" o:title=""/>
                 </v:shape>
-                <o:OLEObject Type="Embed" ProgID="Equation.DSMT4" ShapeID="_x0000_i1326" DrawAspect="Content" ObjectID="_1777568603" r:id="rId8"/>
+                <o:OLEObject Type="Embed" ProgID="Equation.DSMT4" ShapeID="_x0000_i1026" DrawAspect="Content" ObjectID="_1806239240" r:id="rId9"/>
               </w:object>
             </w:r>
             <w:r>
@@ -1277,7 +1285,35 @@
               <w:rPr>
                 <w:lang w:val="en-US"/>
               </w:rPr>
-              <w:t xml:space="preserve"> 15 , 20 , 25</w:t>
+              <w:t xml:space="preserve"> </w:t>
+            </w:r>
+            <w:proofErr w:type="gramStart"/>
+            <w:r>
+              <w:rPr>
+                <w:lang w:val="en-US"/>
+              </w:rPr>
+              <w:t>15 ,</w:t>
+            </w:r>
+            <w:proofErr w:type="gramEnd"/>
+            <w:r>
+              <w:rPr>
+                <w:lang w:val="en-US"/>
+              </w:rPr>
+              <w:t xml:space="preserve"> </w:t>
+            </w:r>
+            <w:proofErr w:type="gramStart"/>
+            <w:r>
+              <w:rPr>
+                <w:lang w:val="en-US"/>
+              </w:rPr>
+              <w:t>20 ,</w:t>
+            </w:r>
+            <w:proofErr w:type="gramEnd"/>
+            <w:r>
+              <w:rPr>
+                <w:lang w:val="en-US"/>
+              </w:rPr>
+              <w:t xml:space="preserve"> 25</w:t>
             </w:r>
             <w:r>
               <w:rPr>
@@ -1458,10 +1494,10 @@
                 <w:position w:val="-48"/>
               </w:rPr>
               <w:object w:dxaOrig="700" w:dyaOrig="1140" w14:anchorId="438314D8">
-                <v:shape id="_x0000_i1361" type="#_x0000_t75" style="width:34.75pt;height:57.1pt" o:ole="">
-                  <v:imagedata r:id="rId9" o:title=""/>
+                <v:shape id="_x0000_i1027" type="#_x0000_t75" style="width:34.65pt;height:57.05pt" o:ole="">
+                  <v:imagedata r:id="rId10" o:title=""/>
                 </v:shape>
-                <o:OLEObject Type="Embed" ProgID="Equation.DSMT4" ShapeID="_x0000_i1361" DrawAspect="Content" ObjectID="_1777568604" r:id="rId10"/>
+                <o:OLEObject Type="Embed" ProgID="Equation.DSMT4" ShapeID="_x0000_i1027" DrawAspect="Content" ObjectID="_1806239241" r:id="rId11"/>
               </w:object>
             </w:r>
           </w:p>
@@ -1535,10 +1571,10 @@
                 <w:position w:val="-74"/>
               </w:rPr>
               <w:object w:dxaOrig="700" w:dyaOrig="1620" w14:anchorId="0476224A">
-                <v:shape id="_x0000_i1328" type="#_x0000_t75" style="width:34.75pt;height:80.7pt" o:ole="">
-                  <v:imagedata r:id="rId11" o:title=""/>
+                <v:shape id="_x0000_i1028" type="#_x0000_t75" style="width:34.65pt;height:80.85pt" o:ole="">
+                  <v:imagedata r:id="rId12" o:title=""/>
                 </v:shape>
-                <o:OLEObject Type="Embed" ProgID="Equation.DSMT4" ShapeID="_x0000_i1328" DrawAspect="Content" ObjectID="_1777568605" r:id="rId12"/>
+                <o:OLEObject Type="Embed" ProgID="Equation.DSMT4" ShapeID="_x0000_i1028" DrawAspect="Content" ObjectID="_1806239242" r:id="rId13"/>
               </w:object>
             </w:r>
           </w:p>
@@ -1601,10 +1637,10 @@
                 <w:position w:val="-28"/>
               </w:rPr>
               <w:object w:dxaOrig="920" w:dyaOrig="760" w14:anchorId="6B04ADC1">
-                <v:shape id="_x0000_i1329" type="#_x0000_t75" style="width:45.95pt;height:37.25pt" o:ole="">
-                  <v:imagedata r:id="rId13" o:title=""/>
+                <v:shape id="_x0000_i1029" type="#_x0000_t75" style="width:46.2pt;height:37.35pt" o:ole="">
+                  <v:imagedata r:id="rId14" o:title=""/>
                 </v:shape>
-                <o:OLEObject Type="Embed" ProgID="Equation.DSMT4" ShapeID="_x0000_i1329" DrawAspect="Content" ObjectID="_1777568606" r:id="rId14"/>
+                <o:OLEObject Type="Embed" ProgID="Equation.DSMT4" ShapeID="_x0000_i1029" DrawAspect="Content" ObjectID="_1806239243" r:id="rId15"/>
               </w:object>
             </w:r>
           </w:p>
@@ -1854,25 +1890,67 @@
               <w:rPr>
                 <w:lang w:val="en-US"/>
               </w:rPr>
-              <w:t xml:space="preserve"> 30 </w:t>
-            </w:r>
-            <w:r>
-              <w:rPr>
-                <w:lang w:val="en-US"/>
-              </w:rPr>
-              <w:t>, 40</w:t>
-            </w:r>
-            <w:r>
-              <w:rPr>
-                <w:lang w:val="en-US"/>
-              </w:rPr>
-              <w:t xml:space="preserve"> , 50</w:t>
-            </w:r>
-            <w:r>
-              <w:rPr>
-                <w:lang w:val="en-US"/>
-              </w:rPr>
-              <w:t xml:space="preserve"> , 60]</w:t>
+              <w:t xml:space="preserve"> </w:t>
+            </w:r>
+            <w:proofErr w:type="gramStart"/>
+            <w:r>
+              <w:rPr>
+                <w:lang w:val="en-US"/>
+              </w:rPr>
+              <w:t xml:space="preserve">30 </w:t>
+            </w:r>
+            <w:r>
+              <w:rPr>
+                <w:lang w:val="en-US"/>
+              </w:rPr>
+              <w:t>,</w:t>
+            </w:r>
+            <w:proofErr w:type="gramEnd"/>
+            <w:r>
+              <w:rPr>
+                <w:lang w:val="en-US"/>
+              </w:rPr>
+              <w:t xml:space="preserve"> </w:t>
+            </w:r>
+            <w:proofErr w:type="gramStart"/>
+            <w:r>
+              <w:rPr>
+                <w:lang w:val="en-US"/>
+              </w:rPr>
+              <w:t>40</w:t>
+            </w:r>
+            <w:r>
+              <w:rPr>
+                <w:lang w:val="en-US"/>
+              </w:rPr>
+              <w:t xml:space="preserve"> ,</w:t>
+            </w:r>
+            <w:proofErr w:type="gramEnd"/>
+            <w:r>
+              <w:rPr>
+                <w:lang w:val="en-US"/>
+              </w:rPr>
+              <w:t xml:space="preserve"> </w:t>
+            </w:r>
+            <w:proofErr w:type="gramStart"/>
+            <w:r>
+              <w:rPr>
+                <w:lang w:val="en-US"/>
+              </w:rPr>
+              <w:t>50</w:t>
+            </w:r>
+            <w:r>
+              <w:rPr>
+                <w:lang w:val="en-US"/>
+              </w:rPr>
+              <w:t xml:space="preserve"> ,</w:t>
+            </w:r>
+            <w:proofErr w:type="gramEnd"/>
+            <w:r>
+              <w:rPr>
+                <w:lang w:val="en-US"/>
+              </w:rPr>
+              <w:t xml:space="preserve"> 60]</w:t>
             </w:r>
           </w:p>
         </w:tc>
@@ -2104,10 +2182,10 @@
                 <w:position w:val="-48"/>
               </w:rPr>
               <w:object w:dxaOrig="700" w:dyaOrig="1140" w14:anchorId="300C6FA4">
-                <v:shape id="_x0000_i1359" type="#_x0000_t75" style="width:34.75pt;height:57.1pt" o:ole="">
-                  <v:imagedata r:id="rId9" o:title=""/>
+                <v:shape id="_x0000_i1030" type="#_x0000_t75" style="width:34.65pt;height:57.05pt" o:ole="">
+                  <v:imagedata r:id="rId10" o:title=""/>
                 </v:shape>
-                <o:OLEObject Type="Embed" ProgID="Equation.DSMT4" ShapeID="_x0000_i1359" DrawAspect="Content" ObjectID="_1777568607" r:id="rId15"/>
+                <o:OLEObject Type="Embed" ProgID="Equation.DSMT4" ShapeID="_x0000_i1030" DrawAspect="Content" ObjectID="_1806239244" r:id="rId16"/>
               </w:object>
             </w:r>
           </w:p>
@@ -2181,10 +2259,10 @@
                 <w:position w:val="-74"/>
               </w:rPr>
               <w:object w:dxaOrig="700" w:dyaOrig="1620" w14:anchorId="6823C057">
-                <v:shape id="_x0000_i1357" type="#_x0000_t75" style="width:34.75pt;height:80.7pt" o:ole="">
-                  <v:imagedata r:id="rId11" o:title=""/>
+                <v:shape id="_x0000_i1031" type="#_x0000_t75" style="width:34.65pt;height:80.85pt" o:ole="">
+                  <v:imagedata r:id="rId12" o:title=""/>
                 </v:shape>
-                <o:OLEObject Type="Embed" ProgID="Equation.DSMT4" ShapeID="_x0000_i1357" DrawAspect="Content" ObjectID="_1777568608" r:id="rId16"/>
+                <o:OLEObject Type="Embed" ProgID="Equation.DSMT4" ShapeID="_x0000_i1031" DrawAspect="Content" ObjectID="_1806239245" r:id="rId17"/>
               </w:object>
             </w:r>
           </w:p>
@@ -2247,10 +2325,10 @@
                 <w:position w:val="-28"/>
               </w:rPr>
               <w:object w:dxaOrig="920" w:dyaOrig="760" w14:anchorId="3E96BAAC">
-                <v:shape id="_x0000_i1332" type="#_x0000_t75" style="width:45.95pt;height:37.25pt" o:ole="">
-                  <v:imagedata r:id="rId13" o:title=""/>
+                <v:shape id="_x0000_i1032" type="#_x0000_t75" style="width:46.2pt;height:37.35pt" o:ole="">
+                  <v:imagedata r:id="rId14" o:title=""/>
                 </v:shape>
-                <o:OLEObject Type="Embed" ProgID="Equation.DSMT4" ShapeID="_x0000_i1332" DrawAspect="Content" ObjectID="_1777568609" r:id="rId17"/>
+                <o:OLEObject Type="Embed" ProgID="Equation.DSMT4" ShapeID="_x0000_i1032" DrawAspect="Content" ObjectID="_1806239246" r:id="rId18"/>
               </w:object>
             </w:r>
           </w:p>
@@ -2545,7 +2623,35 @@
               <w:rPr>
                 <w:lang w:val="en-US"/>
               </w:rPr>
-              <w:t xml:space="preserve"> 30 , 40 , 50]</w:t>
+              <w:t xml:space="preserve"> </w:t>
+            </w:r>
+            <w:proofErr w:type="gramStart"/>
+            <w:r>
+              <w:rPr>
+                <w:lang w:val="en-US"/>
+              </w:rPr>
+              <w:t>30 ,</w:t>
+            </w:r>
+            <w:proofErr w:type="gramEnd"/>
+            <w:r>
+              <w:rPr>
+                <w:lang w:val="en-US"/>
+              </w:rPr>
+              <w:t xml:space="preserve"> </w:t>
+            </w:r>
+            <w:proofErr w:type="gramStart"/>
+            <w:r>
+              <w:rPr>
+                <w:lang w:val="en-US"/>
+              </w:rPr>
+              <w:t>40 ,</w:t>
+            </w:r>
+            <w:proofErr w:type="gramEnd"/>
+            <w:r>
+              <w:rPr>
+                <w:lang w:val="en-US"/>
+              </w:rPr>
+              <w:t xml:space="preserve"> 50]</w:t>
             </w:r>
           </w:p>
         </w:tc>
@@ -2613,7 +2719,35 @@
               <w:rPr>
                 <w:lang w:val="en-US"/>
               </w:rPr>
-              <w:t xml:space="preserve"> 30 , 40 , 40]</w:t>
+              <w:t xml:space="preserve"> </w:t>
+            </w:r>
+            <w:proofErr w:type="gramStart"/>
+            <w:r>
+              <w:rPr>
+                <w:lang w:val="en-US"/>
+              </w:rPr>
+              <w:t>30 ,</w:t>
+            </w:r>
+            <w:proofErr w:type="gramEnd"/>
+            <w:r>
+              <w:rPr>
+                <w:lang w:val="en-US"/>
+              </w:rPr>
+              <w:t xml:space="preserve"> </w:t>
+            </w:r>
+            <w:proofErr w:type="gramStart"/>
+            <w:r>
+              <w:rPr>
+                <w:lang w:val="en-US"/>
+              </w:rPr>
+              <w:t>40 ,</w:t>
+            </w:r>
+            <w:proofErr w:type="gramEnd"/>
+            <w:r>
+              <w:rPr>
+                <w:lang w:val="en-US"/>
+              </w:rPr>
+              <w:t xml:space="preserve"> 40]</w:t>
             </w:r>
           </w:p>
         </w:tc>
@@ -2678,10 +2812,10 @@
                 <w:position w:val="-48"/>
               </w:rPr>
               <w:object w:dxaOrig="700" w:dyaOrig="1140" w14:anchorId="63536D4D">
-                <v:shape id="_x0000_i1352" type="#_x0000_t75" style="width:34.75pt;height:57.1pt" o:ole="">
-                  <v:imagedata r:id="rId18" o:title=""/>
+                <v:shape id="_x0000_i1033" type="#_x0000_t75" style="width:34.65pt;height:57.05pt" o:ole="">
+                  <v:imagedata r:id="rId19" o:title=""/>
                 </v:shape>
-                <o:OLEObject Type="Embed" ProgID="Equation.DSMT4" ShapeID="_x0000_i1352" DrawAspect="Content" ObjectID="_1777568610" r:id="rId19"/>
+                <o:OLEObject Type="Embed" ProgID="Equation.DSMT4" ShapeID="_x0000_i1033" DrawAspect="Content" ObjectID="_1806239247" r:id="rId20"/>
               </w:object>
             </w:r>
           </w:p>
@@ -2755,10 +2889,10 @@
                 <w:position w:val="-74"/>
               </w:rPr>
               <w:object w:dxaOrig="700" w:dyaOrig="1620" w14:anchorId="12950EDF">
-                <v:shape id="_x0000_i1334" type="#_x0000_t75" style="width:34.75pt;height:80.7pt" o:ole="">
-                  <v:imagedata r:id="rId11" o:title=""/>
+                <v:shape id="_x0000_i1034" type="#_x0000_t75" style="width:34.65pt;height:80.85pt" o:ole="">
+                  <v:imagedata r:id="rId12" o:title=""/>
                 </v:shape>
-                <o:OLEObject Type="Embed" ProgID="Equation.DSMT4" ShapeID="_x0000_i1334" DrawAspect="Content" ObjectID="_1777568611" r:id="rId20"/>
+                <o:OLEObject Type="Embed" ProgID="Equation.DSMT4" ShapeID="_x0000_i1034" DrawAspect="Content" ObjectID="_1806239248" r:id="rId21"/>
               </w:object>
             </w:r>
           </w:p>
@@ -2821,10 +2955,10 @@
                 <w:position w:val="-28"/>
               </w:rPr>
               <w:object w:dxaOrig="920" w:dyaOrig="760" w14:anchorId="7B684A10">
-                <v:shape id="_x0000_i1335" type="#_x0000_t75" style="width:45.95pt;height:37.25pt" o:ole="">
-                  <v:imagedata r:id="rId13" o:title=""/>
+                <v:shape id="_x0000_i1035" type="#_x0000_t75" style="width:46.2pt;height:37.35pt" o:ole="">
+                  <v:imagedata r:id="rId14" o:title=""/>
                 </v:shape>
-                <o:OLEObject Type="Embed" ProgID="Equation.DSMT4" ShapeID="_x0000_i1335" DrawAspect="Content" ObjectID="_1777568612" r:id="rId21"/>
+                <o:OLEObject Type="Embed" ProgID="Equation.DSMT4" ShapeID="_x0000_i1035" DrawAspect="Content" ObjectID="_1806239249" r:id="rId22"/>
               </w:object>
             </w:r>
           </w:p>
@@ -3241,10 +3375,10 @@
                 <w:position w:val="-48"/>
               </w:rPr>
               <w:object w:dxaOrig="700" w:dyaOrig="1140" w14:anchorId="59A8D2A8">
-                <v:shape id="_x0000_i1336" type="#_x0000_t75" style="width:34.75pt;height:57.1pt" o:ole="">
-                  <v:imagedata r:id="rId22" o:title=""/>
+                <v:shape id="_x0000_i1036" type="#_x0000_t75" style="width:34.65pt;height:57.05pt" o:ole="">
+                  <v:imagedata r:id="rId23" o:title=""/>
                 </v:shape>
-                <o:OLEObject Type="Embed" ProgID="Equation.DSMT4" ShapeID="_x0000_i1336" DrawAspect="Content" ObjectID="_1777568613" r:id="rId23"/>
+                <o:OLEObject Type="Embed" ProgID="Equation.DSMT4" ShapeID="_x0000_i1036" DrawAspect="Content" ObjectID="_1806239250" r:id="rId24"/>
               </w:object>
             </w:r>
           </w:p>
@@ -3263,10 +3397,10 @@
                 <w:position w:val="-76"/>
               </w:rPr>
               <w:object w:dxaOrig="1500" w:dyaOrig="1660" w14:anchorId="4C99957F">
-                <v:shape id="_x0000_i1337" type="#_x0000_t75" style="width:74.5pt;height:83.15pt" o:ole="">
-                  <v:imagedata r:id="rId24" o:title=""/>
+                <v:shape id="_x0000_i1037" type="#_x0000_t75" style="width:74.7pt;height:82.85pt" o:ole="">
+                  <v:imagedata r:id="rId25" o:title=""/>
                 </v:shape>
-                <o:OLEObject Type="Embed" ProgID="Equation.DSMT4" ShapeID="_x0000_i1337" DrawAspect="Content" ObjectID="_1777568614" r:id="rId25"/>
+                <o:OLEObject Type="Embed" ProgID="Equation.DSMT4" ShapeID="_x0000_i1037" DrawAspect="Content" ObjectID="_1806239251" r:id="rId26"/>
               </w:object>
             </w:r>
             <w:r>
@@ -3338,10 +3472,10 @@
                 <w:position w:val="-74"/>
               </w:rPr>
               <w:object w:dxaOrig="700" w:dyaOrig="1620" w14:anchorId="3CA65D9C">
-                <v:shape id="_x0000_i1338" type="#_x0000_t75" style="width:34.75pt;height:80.7pt" o:ole="">
-                  <v:imagedata r:id="rId11" o:title=""/>
+                <v:shape id="_x0000_i1038" type="#_x0000_t75" style="width:34.65pt;height:80.85pt" o:ole="">
+                  <v:imagedata r:id="rId12" o:title=""/>
                 </v:shape>
-                <o:OLEObject Type="Embed" ProgID="Equation.DSMT4" ShapeID="_x0000_i1338" DrawAspect="Content" ObjectID="_1777568615" r:id="rId26"/>
+                <o:OLEObject Type="Embed" ProgID="Equation.DSMT4" ShapeID="_x0000_i1038" DrawAspect="Content" ObjectID="_1806239252" r:id="rId27"/>
               </w:object>
             </w:r>
           </w:p>
@@ -3404,10 +3538,10 @@
                 <w:position w:val="-28"/>
               </w:rPr>
               <w:object w:dxaOrig="920" w:dyaOrig="760" w14:anchorId="5561F6B2">
-                <v:shape id="_x0000_i1339" type="#_x0000_t75" style="width:45.95pt;height:37.25pt" o:ole="">
-                  <v:imagedata r:id="rId13" o:title=""/>
+                <v:shape id="_x0000_i1039" type="#_x0000_t75" style="width:46.2pt;height:37.35pt" o:ole="">
+                  <v:imagedata r:id="rId14" o:title=""/>
                 </v:shape>
-                <o:OLEObject Type="Embed" ProgID="Equation.DSMT4" ShapeID="_x0000_i1339" DrawAspect="Content" ObjectID="_1777568616" r:id="rId27"/>
+                <o:OLEObject Type="Embed" ProgID="Equation.DSMT4" ShapeID="_x0000_i1039" DrawAspect="Content" ObjectID="_1806239253" r:id="rId28"/>
               </w:object>
             </w:r>
           </w:p>
@@ -3818,10 +3952,10 @@
                 <w:position w:val="-48"/>
               </w:rPr>
               <w:object w:dxaOrig="700" w:dyaOrig="1140" w14:anchorId="4760B5CC">
-                <v:shape id="_x0000_i1340" type="#_x0000_t75" style="width:34.75pt;height:57.1pt" o:ole="">
-                  <v:imagedata r:id="rId22" o:title=""/>
+                <v:shape id="_x0000_i1040" type="#_x0000_t75" style="width:34.65pt;height:57.05pt" o:ole="">
+                  <v:imagedata r:id="rId23" o:title=""/>
                 </v:shape>
-                <o:OLEObject Type="Embed" ProgID="Equation.DSMT4" ShapeID="_x0000_i1340" DrawAspect="Content" ObjectID="_1777568617" r:id="rId28"/>
+                <o:OLEObject Type="Embed" ProgID="Equation.DSMT4" ShapeID="_x0000_i1040" DrawAspect="Content" ObjectID="_1806239254" r:id="rId29"/>
               </w:object>
             </w:r>
           </w:p>
@@ -3892,10 +4026,10 @@
                 <w:position w:val="-48"/>
               </w:rPr>
               <w:object w:dxaOrig="700" w:dyaOrig="1140" w14:anchorId="6648C4E1">
-                <v:shape id="_x0000_i1342" type="#_x0000_t75" style="width:34.75pt;height:57.1pt" o:ole="">
-                  <v:imagedata r:id="rId29" o:title=""/>
+                <v:shape id="_x0000_i1041" type="#_x0000_t75" style="width:34.65pt;height:57.05pt" o:ole="">
+                  <v:imagedata r:id="rId30" o:title=""/>
                 </v:shape>
-                <o:OLEObject Type="Embed" ProgID="Equation.DSMT4" ShapeID="_x0000_i1342" DrawAspect="Content" ObjectID="_1777568618" r:id="rId30"/>
+                <o:OLEObject Type="Embed" ProgID="Equation.DSMT4" ShapeID="_x0000_i1041" DrawAspect="Content" ObjectID="_1806239255" r:id="rId31"/>
               </w:object>
             </w:r>
           </w:p>
@@ -3917,10 +4051,10 @@
                 <w:position w:val="-12"/>
               </w:rPr>
               <w:object w:dxaOrig="620" w:dyaOrig="360" w14:anchorId="526FBBCF">
-                <v:shape id="_x0000_i1343" type="#_x0000_t75" style="width:31.05pt;height:18.6pt" o:ole="">
-                  <v:imagedata r:id="rId31" o:title=""/>
+                <v:shape id="_x0000_i1042" type="#_x0000_t75" style="width:31.25pt;height:18.35pt" o:ole="">
+                  <v:imagedata r:id="rId32" o:title=""/>
                 </v:shape>
-                <o:OLEObject Type="Embed" ProgID="Equation.DSMT4" ShapeID="_x0000_i1343" DrawAspect="Content" ObjectID="_1777568619" r:id="rId32"/>
+                <o:OLEObject Type="Embed" ProgID="Equation.DSMT4" ShapeID="_x0000_i1042" DrawAspect="Content" ObjectID="_1806239256" r:id="rId33"/>
               </w:object>
             </w:r>
             <w:r>
@@ -3983,10 +4117,10 @@
                 <w:position w:val="-28"/>
               </w:rPr>
               <w:object w:dxaOrig="920" w:dyaOrig="760" w14:anchorId="10B5E19B">
-                <v:shape id="_x0000_i1344" type="#_x0000_t75" style="width:45.95pt;height:37.25pt" o:ole="">
-                  <v:imagedata r:id="rId13" o:title=""/>
+                <v:shape id="_x0000_i1043" type="#_x0000_t75" style="width:46.2pt;height:37.35pt" o:ole="">
+                  <v:imagedata r:id="rId14" o:title=""/>
                 </v:shape>
-                <o:OLEObject Type="Embed" ProgID="Equation.DSMT4" ShapeID="_x0000_i1344" DrawAspect="Content" ObjectID="_1777568620" r:id="rId33"/>
+                <o:OLEObject Type="Embed" ProgID="Equation.DSMT4" ShapeID="_x0000_i1043" DrawAspect="Content" ObjectID="_1806239257" r:id="rId34"/>
               </w:object>
             </w:r>
           </w:p>
@@ -4409,10 +4543,10 @@
                 <w:position w:val="-48"/>
               </w:rPr>
               <w:object w:dxaOrig="700" w:dyaOrig="1140" w14:anchorId="3CC0F8E5">
-                <v:shape id="_x0000_i1345" type="#_x0000_t75" style="width:34.75pt;height:57.1pt" o:ole="">
-                  <v:imagedata r:id="rId22" o:title=""/>
+                <v:shape id="_x0000_i1044" type="#_x0000_t75" style="width:34.65pt;height:57.05pt" o:ole="">
+                  <v:imagedata r:id="rId23" o:title=""/>
                 </v:shape>
-                <o:OLEObject Type="Embed" ProgID="Equation.DSMT4" ShapeID="_x0000_i1345" DrawAspect="Content" ObjectID="_1777568621" r:id="rId34"/>
+                <o:OLEObject Type="Embed" ProgID="Equation.DSMT4" ShapeID="_x0000_i1044" DrawAspect="Content" ObjectID="_1806239258" r:id="rId35"/>
               </w:object>
             </w:r>
           </w:p>
@@ -4489,10 +4623,10 @@
                 <w:position w:val="-74"/>
               </w:rPr>
               <w:object w:dxaOrig="700" w:dyaOrig="1620" w14:anchorId="2F021202">
-                <v:shape id="_x0000_i1347" type="#_x0000_t75" style="width:34.75pt;height:80.7pt" o:ole="">
-                  <v:imagedata r:id="rId11" o:title=""/>
+                <v:shape id="_x0000_i1045" type="#_x0000_t75" style="width:34.65pt;height:80.85pt" o:ole="">
+                  <v:imagedata r:id="rId12" o:title=""/>
                 </v:shape>
-                <o:OLEObject Type="Embed" ProgID="Equation.DSMT4" ShapeID="_x0000_i1347" DrawAspect="Content" ObjectID="_1777568622" r:id="rId35"/>
+                <o:OLEObject Type="Embed" ProgID="Equation.DSMT4" ShapeID="_x0000_i1045" DrawAspect="Content" ObjectID="_1806239259" r:id="rId36"/>
               </w:object>
             </w:r>
           </w:p>
@@ -4555,10 +4689,10 @@
                 <w:position w:val="-28"/>
               </w:rPr>
               <w:object w:dxaOrig="920" w:dyaOrig="760" w14:anchorId="7D79B210">
-                <v:shape id="_x0000_i1348" type="#_x0000_t75" style="width:45.95pt;height:37.25pt" o:ole="">
-                  <v:imagedata r:id="rId13" o:title=""/>
+                <v:shape id="_x0000_i1046" type="#_x0000_t75" style="width:46.2pt;height:37.35pt" o:ole="">
+                  <v:imagedata r:id="rId14" o:title=""/>
                 </v:shape>
-                <o:OLEObject Type="Embed" ProgID="Equation.DSMT4" ShapeID="_x0000_i1348" DrawAspect="Content" ObjectID="_1777568623" r:id="rId36"/>
+                <o:OLEObject Type="Embed" ProgID="Equation.DSMT4" ShapeID="_x0000_i1046" DrawAspect="Content" ObjectID="_1806239260" r:id="rId37"/>
               </w:object>
             </w:r>
           </w:p>
@@ -4582,10 +4716,10 @@
                 <w:position w:val="-34"/>
               </w:rPr>
               <w:object w:dxaOrig="4700" w:dyaOrig="780" w14:anchorId="2CC72D4F">
-                <v:shape id="_x0000_i1349" type="#_x0000_t75" style="width:198.6pt;height:32.3pt" o:ole="">
-                  <v:imagedata r:id="rId7" o:title=""/>
+                <v:shape id="_x0000_i1047" type="#_x0000_t75" style="width:198.35pt;height:32.6pt" o:ole="">
+                  <v:imagedata r:id="rId8" o:title=""/>
                 </v:shape>
-                <o:OLEObject Type="Embed" ProgID="Equation.DSMT4" ShapeID="_x0000_i1349" DrawAspect="Content" ObjectID="_1777568624" r:id="rId37"/>
+                <o:OLEObject Type="Embed" ProgID="Equation.DSMT4" ShapeID="_x0000_i1047" DrawAspect="Content" ObjectID="_1806239261" r:id="rId38"/>
               </w:object>
             </w:r>
             <w:r>
@@ -4626,6 +4760,7 @@
         <w:rPr>
           <w:lang w:val="en-US"/>
         </w:rPr>
+        <w:lastRenderedPageBreak/>
         <w:t>Results</w:t>
       </w:r>
     </w:p>
@@ -4679,6 +4814,7 @@
       </w:pPr>
       <w:r>
         <w:rPr>
+          <w:noProof/>
           <w:lang w:val="en-US"/>
         </w:rPr>
         <w:drawing>
@@ -4697,7 +4833,7 @@
                     <pic:cNvPicPr/>
                   </pic:nvPicPr>
                   <pic:blipFill>
-                    <a:blip r:embed="rId38"/>
+                    <a:blip r:embed="rId39"/>
                     <a:stretch>
                       <a:fillRect/>
                     </a:stretch>
@@ -4727,8 +4863,10 @@
       </w:pPr>
       <w:r>
         <w:rPr>
-          <w:lang w:val="en-US"/>
-        </w:rPr>
+          <w:noProof/>
+          <w:lang w:val="en-US"/>
+        </w:rPr>
+        <w:lastRenderedPageBreak/>
         <w:drawing>
           <wp:inline distT="0" distB="0" distL="0" distR="0" wp14:anchorId="6F0B17BA" wp14:editId="1EBC0BCB">
             <wp:extent cx="8863330" cy="4670425"/>
@@ -4742,83 +4880,6 @@
                 <pic:pic xmlns:pic="http://schemas.openxmlformats.org/drawingml/2006/picture">
                   <pic:nvPicPr>
                     <pic:cNvPr id="1144138272" name="Picture 1" descr="A rainbow colored graph of a graph&#10;&#10;Description automatically generated with medium confidence"/>
-                    <pic:cNvPicPr/>
-                  </pic:nvPicPr>
-                  <pic:blipFill>
-                    <a:blip r:embed="rId39"/>
-                    <a:stretch>
-                      <a:fillRect/>
-                    </a:stretch>
-                  </pic:blipFill>
-                  <pic:spPr>
-                    <a:xfrm>
-                      <a:off x="0" y="0"/>
-                      <a:ext cx="8863330" cy="4670425"/>
-                    </a:xfrm>
-                    <a:prstGeom prst="rect">
-                      <a:avLst/>
-                    </a:prstGeom>
-                  </pic:spPr>
-                </pic:pic>
-              </a:graphicData>
-            </a:graphic>
-          </wp:inline>
-        </w:drawing>
-      </w:r>
-    </w:p>
-    <w:p>
-      <w:pPr>
-        <w:spacing w:line="278" w:lineRule="auto"/>
-        <w:jc w:val="left"/>
-        <w:rPr>
-          <w:lang w:val="en-US"/>
-        </w:rPr>
-      </w:pPr>
-      <w:r>
-        <w:rPr>
-          <w:lang w:val="en-US"/>
-        </w:rPr>
-        <w:br w:type="page"/>
-      </w:r>
-    </w:p>
-    <w:p>
-      <w:pPr>
-        <w:pStyle w:val="Heading3"/>
-        <w:rPr>
-          <w:lang w:val="en-US"/>
-        </w:rPr>
-      </w:pPr>
-      <w:r>
-        <w:rPr>
-          <w:lang w:val="en-US"/>
-        </w:rPr>
-        <w:t>Y = 15</w:t>
-      </w:r>
-    </w:p>
-    <w:p>
-      <w:pPr>
-        <w:jc w:val="center"/>
-        <w:rPr>
-          <w:lang w:val="en-US"/>
-        </w:rPr>
-      </w:pPr>
-      <w:r>
-        <w:rPr>
-          <w:lang w:val="en-US"/>
-        </w:rPr>
-        <w:drawing>
-          <wp:inline distT="0" distB="0" distL="0" distR="0" wp14:anchorId="13B24A17" wp14:editId="2727A8CF">
-            <wp:extent cx="8863330" cy="4670425"/>
-            <wp:effectExtent l="0" t="0" r="0" b="0"/>
-            <wp:docPr id="614470558" name="Picture 1"/>
-            <wp:cNvGraphicFramePr>
-              <a:graphicFrameLocks xmlns:a="http://schemas.openxmlformats.org/drawingml/2006/main" noChangeAspect="1"/>
-            </wp:cNvGraphicFramePr>
-            <a:graphic xmlns:a="http://schemas.openxmlformats.org/drawingml/2006/main">
-              <a:graphicData uri="http://schemas.openxmlformats.org/drawingml/2006/picture">
-                <pic:pic xmlns:pic="http://schemas.openxmlformats.org/drawingml/2006/picture">
-                  <pic:nvPicPr>
-                    <pic:cNvPr id="614470558" name=""/>
                     <pic:cNvPicPr/>
                   </pic:nvPicPr>
                   <pic:blipFill>
@@ -4845,6 +4906,36 @@
     </w:p>
     <w:p>
       <w:pPr>
+        <w:spacing w:line="278" w:lineRule="auto"/>
+        <w:jc w:val="left"/>
+        <w:rPr>
+          <w:lang w:val="en-US"/>
+        </w:rPr>
+      </w:pPr>
+      <w:r>
+        <w:rPr>
+          <w:lang w:val="en-US"/>
+        </w:rPr>
+        <w:br w:type="page"/>
+      </w:r>
+    </w:p>
+    <w:p>
+      <w:pPr>
+        <w:pStyle w:val="Heading3"/>
+        <w:rPr>
+          <w:lang w:val="en-US"/>
+        </w:rPr>
+      </w:pPr>
+      <w:r>
+        <w:rPr>
+          <w:lang w:val="en-US"/>
+        </w:rPr>
+        <w:lastRenderedPageBreak/>
+        <w:t>Y = 15</w:t>
+      </w:r>
+    </w:p>
+    <w:p>
+      <w:pPr>
         <w:jc w:val="center"/>
         <w:rPr>
           <w:lang w:val="en-US"/>
@@ -4852,13 +4943,14 @@
       </w:pPr>
       <w:r>
         <w:rPr>
+          <w:noProof/>
           <w:lang w:val="en-US"/>
         </w:rPr>
         <w:drawing>
-          <wp:inline distT="0" distB="0" distL="0" distR="0" wp14:anchorId="06060931" wp14:editId="6637F0C8">
+          <wp:inline distT="0" distB="0" distL="0" distR="0" wp14:anchorId="13B24A17" wp14:editId="2727A8CF">
             <wp:extent cx="8863330" cy="4670425"/>
             <wp:effectExtent l="0" t="0" r="0" b="0"/>
-            <wp:docPr id="426648336" name="Picture 1" descr="A rainbow colored graph on a white background&#10;&#10;Description automatically generated"/>
+            <wp:docPr id="614470558" name="Picture 1"/>
             <wp:cNvGraphicFramePr>
               <a:graphicFrameLocks xmlns:a="http://schemas.openxmlformats.org/drawingml/2006/main" noChangeAspect="1"/>
             </wp:cNvGraphicFramePr>
@@ -4866,7 +4958,7 @@
               <a:graphicData uri="http://schemas.openxmlformats.org/drawingml/2006/picture">
                 <pic:pic xmlns:pic="http://schemas.openxmlformats.org/drawingml/2006/picture">
                   <pic:nvPicPr>
-                    <pic:cNvPr id="426648336" name="Picture 1" descr="A rainbow colored graph on a white background&#10;&#10;Description automatically generated"/>
+                    <pic:cNvPr id="614470558" name=""/>
                     <pic:cNvPicPr/>
                   </pic:nvPicPr>
                   <pic:blipFill>
@@ -4893,35 +4985,6 @@
     </w:p>
     <w:p>
       <w:pPr>
-        <w:spacing w:line="278" w:lineRule="auto"/>
-        <w:jc w:val="left"/>
-        <w:rPr>
-          <w:lang w:val="en-US"/>
-        </w:rPr>
-      </w:pPr>
-      <w:r>
-        <w:rPr>
-          <w:lang w:val="en-US"/>
-        </w:rPr>
-        <w:br w:type="page"/>
-      </w:r>
-    </w:p>
-    <w:p>
-      <w:pPr>
-        <w:pStyle w:val="Heading3"/>
-        <w:rPr>
-          <w:lang w:val="en-US"/>
-        </w:rPr>
-      </w:pPr>
-      <w:r>
-        <w:rPr>
-          <w:lang w:val="en-US"/>
-        </w:rPr>
-        <w:t>Y = 20</w:t>
-      </w:r>
-    </w:p>
-    <w:p>
-      <w:pPr>
         <w:jc w:val="center"/>
         <w:rPr>
           <w:lang w:val="en-US"/>
@@ -4929,13 +4992,15 @@
       </w:pPr>
       <w:r>
         <w:rPr>
-          <w:lang w:val="en-US"/>
-        </w:rPr>
+          <w:noProof/>
+          <w:lang w:val="en-US"/>
+        </w:rPr>
+        <w:lastRenderedPageBreak/>
         <w:drawing>
-          <wp:inline distT="0" distB="0" distL="0" distR="0" wp14:anchorId="3725908E" wp14:editId="770DD520">
+          <wp:inline distT="0" distB="0" distL="0" distR="0" wp14:anchorId="06060931" wp14:editId="6637F0C8">
             <wp:extent cx="8863330" cy="4670425"/>
             <wp:effectExtent l="0" t="0" r="0" b="0"/>
-            <wp:docPr id="260184258" name="Picture 1"/>
+            <wp:docPr id="426648336" name="Picture 1" descr="A rainbow colored graph on a white background&#10;&#10;Description automatically generated"/>
             <wp:cNvGraphicFramePr>
               <a:graphicFrameLocks xmlns:a="http://schemas.openxmlformats.org/drawingml/2006/main" noChangeAspect="1"/>
             </wp:cNvGraphicFramePr>
@@ -4943,7 +5008,7 @@
               <a:graphicData uri="http://schemas.openxmlformats.org/drawingml/2006/picture">
                 <pic:pic xmlns:pic="http://schemas.openxmlformats.org/drawingml/2006/picture">
                   <pic:nvPicPr>
-                    <pic:cNvPr id="260184258" name=""/>
+                    <pic:cNvPr id="426648336" name="Picture 1" descr="A rainbow colored graph on a white background&#10;&#10;Description automatically generated"/>
                     <pic:cNvPicPr/>
                   </pic:nvPicPr>
                   <pic:blipFill>
@@ -4970,6 +5035,36 @@
     </w:p>
     <w:p>
       <w:pPr>
+        <w:spacing w:line="278" w:lineRule="auto"/>
+        <w:jc w:val="left"/>
+        <w:rPr>
+          <w:lang w:val="en-US"/>
+        </w:rPr>
+      </w:pPr>
+      <w:r>
+        <w:rPr>
+          <w:lang w:val="en-US"/>
+        </w:rPr>
+        <w:br w:type="page"/>
+      </w:r>
+    </w:p>
+    <w:p>
+      <w:pPr>
+        <w:pStyle w:val="Heading3"/>
+        <w:rPr>
+          <w:lang w:val="en-US"/>
+        </w:rPr>
+      </w:pPr>
+      <w:r>
+        <w:rPr>
+          <w:lang w:val="en-US"/>
+        </w:rPr>
+        <w:lastRenderedPageBreak/>
+        <w:t>Y = 20</w:t>
+      </w:r>
+    </w:p>
+    <w:p>
+      <w:pPr>
         <w:jc w:val="center"/>
         <w:rPr>
           <w:lang w:val="en-US"/>
@@ -4977,13 +5072,14 @@
       </w:pPr>
       <w:r>
         <w:rPr>
+          <w:noProof/>
           <w:lang w:val="en-US"/>
         </w:rPr>
         <w:drawing>
-          <wp:inline distT="0" distB="0" distL="0" distR="0" wp14:anchorId="73BC7A0A" wp14:editId="49A7D357">
+          <wp:inline distT="0" distB="0" distL="0" distR="0" wp14:anchorId="3725908E" wp14:editId="770DD520">
             <wp:extent cx="8863330" cy="4670425"/>
             <wp:effectExtent l="0" t="0" r="0" b="0"/>
-            <wp:docPr id="1164016604" name="Picture 1" descr="A rainbow colored graph of a graph&#10;&#10;Description automatically generated with medium confidence"/>
+            <wp:docPr id="260184258" name="Picture 1"/>
             <wp:cNvGraphicFramePr>
               <a:graphicFrameLocks xmlns:a="http://schemas.openxmlformats.org/drawingml/2006/main" noChangeAspect="1"/>
             </wp:cNvGraphicFramePr>
@@ -4991,7 +5087,7 @@
               <a:graphicData uri="http://schemas.openxmlformats.org/drawingml/2006/picture">
                 <pic:pic xmlns:pic="http://schemas.openxmlformats.org/drawingml/2006/picture">
                   <pic:nvPicPr>
-                    <pic:cNvPr id="1164016604" name="Picture 1" descr="A rainbow colored graph of a graph&#10;&#10;Description automatically generated with medium confidence"/>
+                    <pic:cNvPr id="260184258" name=""/>
                     <pic:cNvPicPr/>
                   </pic:nvPicPr>
                   <pic:blipFill>
@@ -5018,35 +5114,6 @@
     </w:p>
     <w:p>
       <w:pPr>
-        <w:spacing w:line="278" w:lineRule="auto"/>
-        <w:jc w:val="left"/>
-        <w:rPr>
-          <w:lang w:val="en-US"/>
-        </w:rPr>
-      </w:pPr>
-      <w:r>
-        <w:rPr>
-          <w:lang w:val="en-US"/>
-        </w:rPr>
-        <w:br w:type="page"/>
-      </w:r>
-    </w:p>
-    <w:p>
-      <w:pPr>
-        <w:pStyle w:val="Heading3"/>
-        <w:rPr>
-          <w:lang w:val="en-US"/>
-        </w:rPr>
-      </w:pPr>
-      <w:r>
-        <w:rPr>
-          <w:lang w:val="en-US"/>
-        </w:rPr>
-        <w:t>Y = 25</w:t>
-      </w:r>
-    </w:p>
-    <w:p>
-      <w:pPr>
         <w:jc w:val="center"/>
         <w:rPr>
           <w:lang w:val="en-US"/>
@@ -5054,13 +5121,15 @@
       </w:pPr>
       <w:r>
         <w:rPr>
-          <w:lang w:val="en-US"/>
-        </w:rPr>
+          <w:noProof/>
+          <w:lang w:val="en-US"/>
+        </w:rPr>
+        <w:lastRenderedPageBreak/>
         <w:drawing>
-          <wp:inline distT="0" distB="0" distL="0" distR="0" wp14:anchorId="0F1DE1AB" wp14:editId="35033BF0">
+          <wp:inline distT="0" distB="0" distL="0" distR="0" wp14:anchorId="73BC7A0A" wp14:editId="49A7D357">
             <wp:extent cx="8863330" cy="4670425"/>
             <wp:effectExtent l="0" t="0" r="0" b="0"/>
-            <wp:docPr id="884797641" name="Picture 1"/>
+            <wp:docPr id="1164016604" name="Picture 1" descr="A rainbow colored graph of a graph&#10;&#10;Description automatically generated with medium confidence"/>
             <wp:cNvGraphicFramePr>
               <a:graphicFrameLocks xmlns:a="http://schemas.openxmlformats.org/drawingml/2006/main" noChangeAspect="1"/>
             </wp:cNvGraphicFramePr>
@@ -5068,7 +5137,7 @@
               <a:graphicData uri="http://schemas.openxmlformats.org/drawingml/2006/picture">
                 <pic:pic xmlns:pic="http://schemas.openxmlformats.org/drawingml/2006/picture">
                   <pic:nvPicPr>
-                    <pic:cNvPr id="884797641" name=""/>
+                    <pic:cNvPr id="1164016604" name="Picture 1" descr="A rainbow colored graph of a graph&#10;&#10;Description automatically generated with medium confidence"/>
                     <pic:cNvPicPr/>
                   </pic:nvPicPr>
                   <pic:blipFill>
@@ -5095,6 +5164,36 @@
     </w:p>
     <w:p>
       <w:pPr>
+        <w:spacing w:line="278" w:lineRule="auto"/>
+        <w:jc w:val="left"/>
+        <w:rPr>
+          <w:lang w:val="en-US"/>
+        </w:rPr>
+      </w:pPr>
+      <w:r>
+        <w:rPr>
+          <w:lang w:val="en-US"/>
+        </w:rPr>
+        <w:br w:type="page"/>
+      </w:r>
+    </w:p>
+    <w:p>
+      <w:pPr>
+        <w:pStyle w:val="Heading3"/>
+        <w:rPr>
+          <w:lang w:val="en-US"/>
+        </w:rPr>
+      </w:pPr>
+      <w:r>
+        <w:rPr>
+          <w:lang w:val="en-US"/>
+        </w:rPr>
+        <w:lastRenderedPageBreak/>
+        <w:t>Y = 25</w:t>
+      </w:r>
+    </w:p>
+    <w:p>
+      <w:pPr>
         <w:jc w:val="center"/>
         <w:rPr>
           <w:lang w:val="en-US"/>
@@ -5102,13 +5201,14 @@
       </w:pPr>
       <w:r>
         <w:rPr>
+          <w:noProof/>
           <w:lang w:val="en-US"/>
         </w:rPr>
         <w:drawing>
-          <wp:inline distT="0" distB="0" distL="0" distR="0" wp14:anchorId="52A413B9" wp14:editId="3DA72A3C">
+          <wp:inline distT="0" distB="0" distL="0" distR="0" wp14:anchorId="0F1DE1AB" wp14:editId="35033BF0">
             <wp:extent cx="8863330" cy="4670425"/>
             <wp:effectExtent l="0" t="0" r="0" b="0"/>
-            <wp:docPr id="1149148102" name="Picture 1" descr="A rainbow colored graph of a graph&#10;&#10;Description automatically generated with medium confidence"/>
+            <wp:docPr id="884797641" name="Picture 1"/>
             <wp:cNvGraphicFramePr>
               <a:graphicFrameLocks xmlns:a="http://schemas.openxmlformats.org/drawingml/2006/main" noChangeAspect="1"/>
             </wp:cNvGraphicFramePr>
@@ -5116,7 +5216,7 @@
               <a:graphicData uri="http://schemas.openxmlformats.org/drawingml/2006/picture">
                 <pic:pic xmlns:pic="http://schemas.openxmlformats.org/drawingml/2006/picture">
                   <pic:nvPicPr>
-                    <pic:cNvPr id="1149148102" name="Picture 1" descr="A rainbow colored graph of a graph&#10;&#10;Description automatically generated with medium confidence"/>
+                    <pic:cNvPr id="884797641" name=""/>
                     <pic:cNvPicPr/>
                   </pic:nvPicPr>
                   <pic:blipFill>
@@ -5143,49 +5243,6 @@
     </w:p>
     <w:p>
       <w:pPr>
-        <w:spacing w:line="278" w:lineRule="auto"/>
-        <w:jc w:val="left"/>
-        <w:rPr>
-          <w:lang w:val="en-US"/>
-        </w:rPr>
-      </w:pPr>
-      <w:r>
-        <w:rPr>
-          <w:lang w:val="en-US"/>
-        </w:rPr>
-        <w:br w:type="page"/>
-      </w:r>
-    </w:p>
-    <w:p>
-      <w:pPr>
-        <w:pStyle w:val="Heading2"/>
-        <w:rPr>
-          <w:lang w:val="en-US"/>
-        </w:rPr>
-      </w:pPr>
-      <w:r>
-        <w:rPr>
-          <w:lang w:val="en-US"/>
-        </w:rPr>
-        <w:t>Domain aspect ratio sensitivity</w:t>
-      </w:r>
-    </w:p>
-    <w:p>
-      <w:pPr>
-        <w:pStyle w:val="Heading3"/>
-        <w:rPr>
-          <w:lang w:val="en-US"/>
-        </w:rPr>
-      </w:pPr>
-      <w:r>
-        <w:rPr>
-          <w:lang w:val="en-US"/>
-        </w:rPr>
-        <w:t>X = 20</w:t>
-      </w:r>
-    </w:p>
-    <w:p>
-      <w:pPr>
         <w:jc w:val="center"/>
         <w:rPr>
           <w:lang w:val="en-US"/>
@@ -5193,13 +5250,15 @@
       </w:pPr>
       <w:r>
         <w:rPr>
-          <w:lang w:val="en-US"/>
-        </w:rPr>
+          <w:noProof/>
+          <w:lang w:val="en-US"/>
+        </w:rPr>
+        <w:lastRenderedPageBreak/>
         <w:drawing>
-          <wp:inline distT="0" distB="0" distL="0" distR="0" wp14:anchorId="25D826D3" wp14:editId="0672799C">
+          <wp:inline distT="0" distB="0" distL="0" distR="0" wp14:anchorId="52A413B9" wp14:editId="3DA72A3C">
             <wp:extent cx="8863330" cy="4670425"/>
             <wp:effectExtent l="0" t="0" r="0" b="0"/>
-            <wp:docPr id="1009730794" name="Picture 1"/>
+            <wp:docPr id="1149148102" name="Picture 1" descr="A rainbow colored graph of a graph&#10;&#10;Description automatically generated with medium confidence"/>
             <wp:cNvGraphicFramePr>
               <a:graphicFrameLocks xmlns:a="http://schemas.openxmlformats.org/drawingml/2006/main" noChangeAspect="1"/>
             </wp:cNvGraphicFramePr>
@@ -5207,11 +5266,11 @@
               <a:graphicData uri="http://schemas.openxmlformats.org/drawingml/2006/picture">
                 <pic:pic xmlns:pic="http://schemas.openxmlformats.org/drawingml/2006/picture">
                   <pic:nvPicPr>
-                    <pic:cNvPr id="884797641" name=""/>
+                    <pic:cNvPr id="1149148102" name="Picture 1" descr="A rainbow colored graph of a graph&#10;&#10;Description automatically generated with medium confidence"/>
                     <pic:cNvPicPr/>
                   </pic:nvPicPr>
                   <pic:blipFill>
-                    <a:blip r:embed="rId44"/>
+                    <a:blip r:embed="rId46"/>
                     <a:stretch>
                       <a:fillRect/>
                     </a:stretch>
@@ -5234,28 +5293,65 @@
     </w:p>
     <w:p>
       <w:pPr>
+        <w:spacing w:line="278" w:lineRule="auto"/>
+        <w:jc w:val="left"/>
+        <w:rPr>
+          <w:lang w:val="en-US"/>
+        </w:rPr>
+      </w:pPr>
+      <w:r>
+        <w:rPr>
+          <w:lang w:val="en-US"/>
+        </w:rPr>
+        <w:br w:type="page"/>
+      </w:r>
+    </w:p>
+    <w:p>
+      <w:pPr>
+        <w:pStyle w:val="Heading2"/>
+        <w:rPr>
+          <w:lang w:val="en-US"/>
+        </w:rPr>
+      </w:pPr>
+      <w:r>
+        <w:rPr>
+          <w:lang w:val="en-US"/>
+        </w:rPr>
+        <w:lastRenderedPageBreak/>
+        <w:t>Domain aspect ratio sensitivity</w:t>
+      </w:r>
+    </w:p>
+    <w:p>
+      <w:pPr>
+        <w:pStyle w:val="Heading3"/>
+        <w:rPr>
+          <w:lang w:val="en-US"/>
+        </w:rPr>
+      </w:pPr>
+      <w:r>
+        <w:rPr>
+          <w:lang w:val="en-US"/>
+        </w:rPr>
+        <w:t>X = 20</w:t>
+      </w:r>
+    </w:p>
+    <w:p>
+      <w:pPr>
         <w:jc w:val="center"/>
         <w:rPr>
           <w:lang w:val="en-US"/>
         </w:rPr>
       </w:pPr>
-    </w:p>
-    <w:p>
-      <w:pPr>
-        <w:jc w:val="center"/>
-        <w:rPr>
-          <w:lang w:val="en-US"/>
-        </w:rPr>
-      </w:pPr>
-      <w:r>
-        <w:rPr>
+      <w:r>
+        <w:rPr>
+          <w:noProof/>
           <w:lang w:val="en-US"/>
         </w:rPr>
         <w:drawing>
-          <wp:inline distT="0" distB="0" distL="0" distR="0" wp14:anchorId="54E91700" wp14:editId="56733E5E">
+          <wp:inline distT="0" distB="0" distL="0" distR="0" wp14:anchorId="25D826D3" wp14:editId="0672799C">
             <wp:extent cx="8863330" cy="4670425"/>
             <wp:effectExtent l="0" t="0" r="0" b="0"/>
-            <wp:docPr id="1362283189" name="Picture 1" descr="A rainbow colored graph of a graph&#10;&#10;Description automatically generated with medium confidence"/>
+            <wp:docPr id="1009730794" name="Picture 1"/>
             <wp:cNvGraphicFramePr>
               <a:graphicFrameLocks xmlns:a="http://schemas.openxmlformats.org/drawingml/2006/main" noChangeAspect="1"/>
             </wp:cNvGraphicFramePr>
@@ -5263,7 +5359,7 @@
               <a:graphicData uri="http://schemas.openxmlformats.org/drawingml/2006/picture">
                 <pic:pic xmlns:pic="http://schemas.openxmlformats.org/drawingml/2006/picture">
                   <pic:nvPicPr>
-                    <pic:cNvPr id="1149148102" name="Picture 1" descr="A rainbow colored graph of a graph&#10;&#10;Description automatically generated with medium confidence"/>
+                    <pic:cNvPr id="884797641" name=""/>
                     <pic:cNvPicPr/>
                   </pic:nvPicPr>
                   <pic:blipFill>
@@ -5290,49 +5386,29 @@
     </w:p>
     <w:p>
       <w:pPr>
-        <w:spacing w:line="278" w:lineRule="auto"/>
-        <w:jc w:val="left"/>
-        <w:rPr>
-          <w:lang w:val="en-US"/>
-        </w:rPr>
-      </w:pPr>
-      <w:r>
-        <w:rPr>
-          <w:lang w:val="en-US"/>
-        </w:rPr>
-        <w:br w:type="page"/>
-      </w:r>
-    </w:p>
-    <w:p>
-      <w:pPr>
-        <w:pStyle w:val="Heading3"/>
-        <w:rPr>
-          <w:lang w:val="en-US"/>
-        </w:rPr>
-      </w:pPr>
-      <w:r>
-        <w:rPr>
-          <w:lang w:val="en-US"/>
-        </w:rPr>
-        <w:t>X = 30</w:t>
-      </w:r>
-    </w:p>
-    <w:p>
-      <w:pPr>
         <w:jc w:val="center"/>
         <w:rPr>
           <w:lang w:val="en-US"/>
         </w:rPr>
       </w:pPr>
-      <w:r>
-        <w:rPr>
+    </w:p>
+    <w:p>
+      <w:pPr>
+        <w:jc w:val="center"/>
+        <w:rPr>
+          <w:lang w:val="en-US"/>
+        </w:rPr>
+      </w:pPr>
+      <w:r>
+        <w:rPr>
+          <w:noProof/>
           <w:lang w:val="en-US"/>
         </w:rPr>
         <w:drawing>
-          <wp:inline distT="0" distB="0" distL="0" distR="0" wp14:anchorId="7A86F39D" wp14:editId="288E0CB4">
+          <wp:inline distT="0" distB="0" distL="0" distR="0" wp14:anchorId="54E91700" wp14:editId="56733E5E">
             <wp:extent cx="8863330" cy="4670425"/>
             <wp:effectExtent l="0" t="0" r="0" b="0"/>
-            <wp:docPr id="720572604" name="Picture 1" descr="A group of graphs of different colors&#10;&#10;Description automatically generated with medium confidence"/>
+            <wp:docPr id="1362283189" name="Picture 1" descr="A rainbow colored graph of a graph&#10;&#10;Description automatically generated with medium confidence"/>
             <wp:cNvGraphicFramePr>
               <a:graphicFrameLocks xmlns:a="http://schemas.openxmlformats.org/drawingml/2006/main" noChangeAspect="1"/>
             </wp:cNvGraphicFramePr>
@@ -5340,7 +5416,7 @@
               <a:graphicData uri="http://schemas.openxmlformats.org/drawingml/2006/picture">
                 <pic:pic xmlns:pic="http://schemas.openxmlformats.org/drawingml/2006/picture">
                   <pic:nvPicPr>
-                    <pic:cNvPr id="720572604" name="Picture 1" descr="A group of graphs of different colors&#10;&#10;Description automatically generated with medium confidence"/>
+                    <pic:cNvPr id="1149148102" name="Picture 1" descr="A rainbow colored graph of a graph&#10;&#10;Description automatically generated with medium confidence"/>
                     <pic:cNvPicPr/>
                   </pic:nvPicPr>
                   <pic:blipFill>
@@ -5367,6 +5443,36 @@
     </w:p>
     <w:p>
       <w:pPr>
+        <w:spacing w:line="278" w:lineRule="auto"/>
+        <w:jc w:val="left"/>
+        <w:rPr>
+          <w:lang w:val="en-US"/>
+        </w:rPr>
+      </w:pPr>
+      <w:r>
+        <w:rPr>
+          <w:lang w:val="en-US"/>
+        </w:rPr>
+        <w:br w:type="page"/>
+      </w:r>
+    </w:p>
+    <w:p>
+      <w:pPr>
+        <w:pStyle w:val="Heading3"/>
+        <w:rPr>
+          <w:lang w:val="en-US"/>
+        </w:rPr>
+      </w:pPr>
+      <w:r>
+        <w:rPr>
+          <w:lang w:val="en-US"/>
+        </w:rPr>
+        <w:lastRenderedPageBreak/>
+        <w:t>X = 30</w:t>
+      </w:r>
+    </w:p>
+    <w:p>
+      <w:pPr>
         <w:jc w:val="center"/>
         <w:rPr>
           <w:lang w:val="en-US"/>
@@ -5374,13 +5480,14 @@
       </w:pPr>
       <w:r>
         <w:rPr>
+          <w:noProof/>
           <w:lang w:val="en-US"/>
         </w:rPr>
         <w:drawing>
-          <wp:inline distT="0" distB="0" distL="0" distR="0" wp14:anchorId="08835423" wp14:editId="6F419EE1">
+          <wp:inline distT="0" distB="0" distL="0" distR="0" wp14:anchorId="7A86F39D" wp14:editId="288E0CB4">
             <wp:extent cx="8863330" cy="4670425"/>
             <wp:effectExtent l="0" t="0" r="0" b="0"/>
-            <wp:docPr id="752890260" name="Picture 1" descr="A rainbow colored graph of a graph&#10;&#10;Description automatically generated with medium confidence"/>
+            <wp:docPr id="720572604" name="Picture 1" descr="A group of graphs of different colors&#10;&#10;Description automatically generated with medium confidence"/>
             <wp:cNvGraphicFramePr>
               <a:graphicFrameLocks xmlns:a="http://schemas.openxmlformats.org/drawingml/2006/main" noChangeAspect="1"/>
             </wp:cNvGraphicFramePr>
@@ -5388,7 +5495,7 @@
               <a:graphicData uri="http://schemas.openxmlformats.org/drawingml/2006/picture">
                 <pic:pic xmlns:pic="http://schemas.openxmlformats.org/drawingml/2006/picture">
                   <pic:nvPicPr>
-                    <pic:cNvPr id="752890260" name="Picture 1" descr="A rainbow colored graph of a graph&#10;&#10;Description automatically generated with medium confidence"/>
+                    <pic:cNvPr id="720572604" name="Picture 1" descr="A group of graphs of different colors&#10;&#10;Description automatically generated with medium confidence"/>
                     <pic:cNvPicPr/>
                   </pic:nvPicPr>
                   <pic:blipFill>
@@ -5415,35 +5522,6 @@
     </w:p>
     <w:p>
       <w:pPr>
-        <w:spacing w:line="278" w:lineRule="auto"/>
-        <w:jc w:val="left"/>
-        <w:rPr>
-          <w:lang w:val="en-US"/>
-        </w:rPr>
-      </w:pPr>
-      <w:r>
-        <w:rPr>
-          <w:lang w:val="en-US"/>
-        </w:rPr>
-        <w:br w:type="page"/>
-      </w:r>
-    </w:p>
-    <w:p>
-      <w:pPr>
-        <w:pStyle w:val="Heading3"/>
-        <w:rPr>
-          <w:lang w:val="en-US"/>
-        </w:rPr>
-      </w:pPr>
-      <w:r>
-        <w:rPr>
-          <w:lang w:val="en-US"/>
-        </w:rPr>
-        <w:t>X = 40</w:t>
-      </w:r>
-    </w:p>
-    <w:p>
-      <w:pPr>
         <w:jc w:val="center"/>
         <w:rPr>
           <w:lang w:val="en-US"/>
@@ -5451,13 +5529,15 @@
       </w:pPr>
       <w:r>
         <w:rPr>
-          <w:lang w:val="en-US"/>
-        </w:rPr>
+          <w:noProof/>
+          <w:lang w:val="en-US"/>
+        </w:rPr>
+        <w:lastRenderedPageBreak/>
         <w:drawing>
-          <wp:inline distT="0" distB="0" distL="0" distR="0" wp14:anchorId="28C9D90A" wp14:editId="191DA454">
+          <wp:inline distT="0" distB="0" distL="0" distR="0" wp14:anchorId="08835423" wp14:editId="6F419EE1">
             <wp:extent cx="8863330" cy="4670425"/>
             <wp:effectExtent l="0" t="0" r="0" b="0"/>
-            <wp:docPr id="532575160" name="Picture 1"/>
+            <wp:docPr id="752890260" name="Picture 1" descr="A rainbow colored graph of a graph&#10;&#10;Description automatically generated with medium confidence"/>
             <wp:cNvGraphicFramePr>
               <a:graphicFrameLocks xmlns:a="http://schemas.openxmlformats.org/drawingml/2006/main" noChangeAspect="1"/>
             </wp:cNvGraphicFramePr>
@@ -5465,7 +5545,7 @@
               <a:graphicData uri="http://schemas.openxmlformats.org/drawingml/2006/picture">
                 <pic:pic xmlns:pic="http://schemas.openxmlformats.org/drawingml/2006/picture">
                   <pic:nvPicPr>
-                    <pic:cNvPr id="532575160" name=""/>
+                    <pic:cNvPr id="752890260" name="Picture 1" descr="A rainbow colored graph of a graph&#10;&#10;Description automatically generated with medium confidence"/>
                     <pic:cNvPicPr/>
                   </pic:nvPicPr>
                   <pic:blipFill>
@@ -5492,6 +5572,36 @@
     </w:p>
     <w:p>
       <w:pPr>
+        <w:spacing w:line="278" w:lineRule="auto"/>
+        <w:jc w:val="left"/>
+        <w:rPr>
+          <w:lang w:val="en-US"/>
+        </w:rPr>
+      </w:pPr>
+      <w:r>
+        <w:rPr>
+          <w:lang w:val="en-US"/>
+        </w:rPr>
+        <w:br w:type="page"/>
+      </w:r>
+    </w:p>
+    <w:p>
+      <w:pPr>
+        <w:pStyle w:val="Heading3"/>
+        <w:rPr>
+          <w:lang w:val="en-US"/>
+        </w:rPr>
+      </w:pPr>
+      <w:r>
+        <w:rPr>
+          <w:lang w:val="en-US"/>
+        </w:rPr>
+        <w:lastRenderedPageBreak/>
+        <w:t>X = 40</w:t>
+      </w:r>
+    </w:p>
+    <w:p>
+      <w:pPr>
         <w:jc w:val="center"/>
         <w:rPr>
           <w:lang w:val="en-US"/>
@@ -5499,13 +5609,14 @@
       </w:pPr>
       <w:r>
         <w:rPr>
+          <w:noProof/>
           <w:lang w:val="en-US"/>
         </w:rPr>
         <w:drawing>
-          <wp:inline distT="0" distB="0" distL="0" distR="0" wp14:anchorId="5CA083DC" wp14:editId="2063B52A">
+          <wp:inline distT="0" distB="0" distL="0" distR="0" wp14:anchorId="28C9D90A" wp14:editId="191DA454">
             <wp:extent cx="8863330" cy="4670425"/>
             <wp:effectExtent l="0" t="0" r="0" b="0"/>
-            <wp:docPr id="49438670" name="Picture 1" descr="A graph of a graph of a graph&#10;&#10;Description automatically generated with medium confidence"/>
+            <wp:docPr id="532575160" name="Picture 1"/>
             <wp:cNvGraphicFramePr>
               <a:graphicFrameLocks xmlns:a="http://schemas.openxmlformats.org/drawingml/2006/main" noChangeAspect="1"/>
             </wp:cNvGraphicFramePr>
@@ -5513,7 +5624,7 @@
               <a:graphicData uri="http://schemas.openxmlformats.org/drawingml/2006/picture">
                 <pic:pic xmlns:pic="http://schemas.openxmlformats.org/drawingml/2006/picture">
                   <pic:nvPicPr>
-                    <pic:cNvPr id="49438670" name="Picture 1" descr="A graph of a graph of a graph&#10;&#10;Description automatically generated with medium confidence"/>
+                    <pic:cNvPr id="532575160" name=""/>
                     <pic:cNvPicPr/>
                   </pic:nvPicPr>
                   <pic:blipFill>
@@ -5540,35 +5651,6 @@
     </w:p>
     <w:p>
       <w:pPr>
-        <w:spacing w:line="278" w:lineRule="auto"/>
-        <w:jc w:val="left"/>
-        <w:rPr>
-          <w:lang w:val="en-US"/>
-        </w:rPr>
-      </w:pPr>
-      <w:r>
-        <w:rPr>
-          <w:lang w:val="en-US"/>
-        </w:rPr>
-        <w:br w:type="page"/>
-      </w:r>
-    </w:p>
-    <w:p>
-      <w:pPr>
-        <w:pStyle w:val="Heading3"/>
-        <w:rPr>
-          <w:lang w:val="en-US"/>
-        </w:rPr>
-      </w:pPr>
-      <w:r>
-        <w:rPr>
-          <w:lang w:val="en-US"/>
-        </w:rPr>
-        <w:t>X = 50</w:t>
-      </w:r>
-    </w:p>
-    <w:p>
-      <w:pPr>
         <w:jc w:val="center"/>
         <w:rPr>
           <w:lang w:val="en-US"/>
@@ -5576,13 +5658,15 @@
       </w:pPr>
       <w:r>
         <w:rPr>
-          <w:lang w:val="en-US"/>
-        </w:rPr>
+          <w:noProof/>
+          <w:lang w:val="en-US"/>
+        </w:rPr>
+        <w:lastRenderedPageBreak/>
         <w:drawing>
-          <wp:inline distT="0" distB="0" distL="0" distR="0" wp14:anchorId="772EEC4C" wp14:editId="7BD7D7AD">
+          <wp:inline distT="0" distB="0" distL="0" distR="0" wp14:anchorId="5CA083DC" wp14:editId="2063B52A">
             <wp:extent cx="8863330" cy="4670425"/>
             <wp:effectExtent l="0" t="0" r="0" b="0"/>
-            <wp:docPr id="1957590662" name="Picture 1"/>
+            <wp:docPr id="49438670" name="Picture 1" descr="A graph of a graph of a graph&#10;&#10;Description automatically generated with medium confidence"/>
             <wp:cNvGraphicFramePr>
               <a:graphicFrameLocks xmlns:a="http://schemas.openxmlformats.org/drawingml/2006/main" noChangeAspect="1"/>
             </wp:cNvGraphicFramePr>
@@ -5590,7 +5674,7 @@
               <a:graphicData uri="http://schemas.openxmlformats.org/drawingml/2006/picture">
                 <pic:pic xmlns:pic="http://schemas.openxmlformats.org/drawingml/2006/picture">
                   <pic:nvPicPr>
-                    <pic:cNvPr id="1957590662" name=""/>
+                    <pic:cNvPr id="49438670" name="Picture 1" descr="A graph of a graph of a graph&#10;&#10;Description automatically generated with medium confidence"/>
                     <pic:cNvPicPr/>
                   </pic:nvPicPr>
                   <pic:blipFill>
@@ -5617,6 +5701,36 @@
     </w:p>
     <w:p>
       <w:pPr>
+        <w:spacing w:line="278" w:lineRule="auto"/>
+        <w:jc w:val="left"/>
+        <w:rPr>
+          <w:lang w:val="en-US"/>
+        </w:rPr>
+      </w:pPr>
+      <w:r>
+        <w:rPr>
+          <w:lang w:val="en-US"/>
+        </w:rPr>
+        <w:br w:type="page"/>
+      </w:r>
+    </w:p>
+    <w:p>
+      <w:pPr>
+        <w:pStyle w:val="Heading3"/>
+        <w:rPr>
+          <w:lang w:val="en-US"/>
+        </w:rPr>
+      </w:pPr>
+      <w:r>
+        <w:rPr>
+          <w:lang w:val="en-US"/>
+        </w:rPr>
+        <w:lastRenderedPageBreak/>
+        <w:t>X = 50</w:t>
+      </w:r>
+    </w:p>
+    <w:p>
+      <w:pPr>
         <w:jc w:val="center"/>
         <w:rPr>
           <w:lang w:val="en-US"/>
@@ -5624,13 +5738,14 @@
       </w:pPr>
       <w:r>
         <w:rPr>
+          <w:noProof/>
           <w:lang w:val="en-US"/>
         </w:rPr>
         <w:drawing>
-          <wp:inline distT="0" distB="0" distL="0" distR="0" wp14:anchorId="1A45D78E" wp14:editId="29AB6543">
+          <wp:inline distT="0" distB="0" distL="0" distR="0" wp14:anchorId="772EEC4C" wp14:editId="7BD7D7AD">
             <wp:extent cx="8863330" cy="4670425"/>
             <wp:effectExtent l="0" t="0" r="0" b="0"/>
-            <wp:docPr id="2004946450" name="Picture 1" descr="A rainbow colored graph on a white background&#10;&#10;Description automatically generated"/>
+            <wp:docPr id="1957590662" name="Picture 1"/>
             <wp:cNvGraphicFramePr>
               <a:graphicFrameLocks xmlns:a="http://schemas.openxmlformats.org/drawingml/2006/main" noChangeAspect="1"/>
             </wp:cNvGraphicFramePr>
@@ -5638,7 +5753,7 @@
               <a:graphicData uri="http://schemas.openxmlformats.org/drawingml/2006/picture">
                 <pic:pic xmlns:pic="http://schemas.openxmlformats.org/drawingml/2006/picture">
                   <pic:nvPicPr>
-                    <pic:cNvPr id="2004946450" name="Picture 1" descr="A rainbow colored graph on a white background&#10;&#10;Description automatically generated"/>
+                    <pic:cNvPr id="1957590662" name=""/>
                     <pic:cNvPicPr/>
                   </pic:nvPicPr>
                   <pic:blipFill>
@@ -5665,35 +5780,6 @@
     </w:p>
     <w:p>
       <w:pPr>
-        <w:spacing w:line="278" w:lineRule="auto"/>
-        <w:jc w:val="left"/>
-        <w:rPr>
-          <w:lang w:val="en-US"/>
-        </w:rPr>
-      </w:pPr>
-      <w:r>
-        <w:rPr>
-          <w:lang w:val="en-US"/>
-        </w:rPr>
-        <w:br w:type="page"/>
-      </w:r>
-    </w:p>
-    <w:p>
-      <w:pPr>
-        <w:pStyle w:val="Heading3"/>
-        <w:rPr>
-          <w:lang w:val="en-US"/>
-        </w:rPr>
-      </w:pPr>
-      <w:r>
-        <w:rPr>
-          <w:lang w:val="en-US"/>
-        </w:rPr>
-        <w:t>X = 60</w:t>
-      </w:r>
-    </w:p>
-    <w:p>
-      <w:pPr>
         <w:jc w:val="center"/>
         <w:rPr>
           <w:lang w:val="en-US"/>
@@ -5701,13 +5787,15 @@
       </w:pPr>
       <w:r>
         <w:rPr>
-          <w:lang w:val="en-US"/>
-        </w:rPr>
+          <w:noProof/>
+          <w:lang w:val="en-US"/>
+        </w:rPr>
+        <w:lastRenderedPageBreak/>
         <w:drawing>
-          <wp:inline distT="0" distB="0" distL="0" distR="0" wp14:anchorId="048208A0" wp14:editId="2727F47A">
+          <wp:inline distT="0" distB="0" distL="0" distR="0" wp14:anchorId="1A45D78E" wp14:editId="29AB6543">
             <wp:extent cx="8863330" cy="4670425"/>
             <wp:effectExtent l="0" t="0" r="0" b="0"/>
-            <wp:docPr id="841475619" name="Picture 1"/>
+            <wp:docPr id="2004946450" name="Picture 1" descr="A rainbow colored graph on a white background&#10;&#10;Description automatically generated"/>
             <wp:cNvGraphicFramePr>
               <a:graphicFrameLocks xmlns:a="http://schemas.openxmlformats.org/drawingml/2006/main" noChangeAspect="1"/>
             </wp:cNvGraphicFramePr>
@@ -5715,7 +5803,7 @@
               <a:graphicData uri="http://schemas.openxmlformats.org/drawingml/2006/picture">
                 <pic:pic xmlns:pic="http://schemas.openxmlformats.org/drawingml/2006/picture">
                   <pic:nvPicPr>
-                    <pic:cNvPr id="841475619" name=""/>
+                    <pic:cNvPr id="2004946450" name="Picture 1" descr="A rainbow colored graph on a white background&#10;&#10;Description automatically generated"/>
                     <pic:cNvPicPr/>
                   </pic:nvPicPr>
                   <pic:blipFill>
@@ -5742,6 +5830,36 @@
     </w:p>
     <w:p>
       <w:pPr>
+        <w:spacing w:line="278" w:lineRule="auto"/>
+        <w:jc w:val="left"/>
+        <w:rPr>
+          <w:lang w:val="en-US"/>
+        </w:rPr>
+      </w:pPr>
+      <w:r>
+        <w:rPr>
+          <w:lang w:val="en-US"/>
+        </w:rPr>
+        <w:br w:type="page"/>
+      </w:r>
+    </w:p>
+    <w:p>
+      <w:pPr>
+        <w:pStyle w:val="Heading3"/>
+        <w:rPr>
+          <w:lang w:val="en-US"/>
+        </w:rPr>
+      </w:pPr>
+      <w:r>
+        <w:rPr>
+          <w:lang w:val="en-US"/>
+        </w:rPr>
+        <w:lastRenderedPageBreak/>
+        <w:t>X = 60</w:t>
+      </w:r>
+    </w:p>
+    <w:p>
+      <w:pPr>
         <w:jc w:val="center"/>
         <w:rPr>
           <w:lang w:val="en-US"/>
@@ -5749,13 +5867,14 @@
       </w:pPr>
       <w:r>
         <w:rPr>
+          <w:noProof/>
           <w:lang w:val="en-US"/>
         </w:rPr>
         <w:drawing>
-          <wp:inline distT="0" distB="0" distL="0" distR="0" wp14:anchorId="22C60A54" wp14:editId="4264BD04">
+          <wp:inline distT="0" distB="0" distL="0" distR="0" wp14:anchorId="048208A0" wp14:editId="2727F47A">
             <wp:extent cx="8863330" cy="4670425"/>
             <wp:effectExtent l="0" t="0" r="0" b="0"/>
-            <wp:docPr id="1641390364" name="Picture 1" descr="A graph of a graph of a graph&#10;&#10;Description automatically generated with medium confidence"/>
+            <wp:docPr id="841475619" name="Picture 1"/>
             <wp:cNvGraphicFramePr>
               <a:graphicFrameLocks xmlns:a="http://schemas.openxmlformats.org/drawingml/2006/main" noChangeAspect="1"/>
             </wp:cNvGraphicFramePr>
@@ -5763,7 +5882,7 @@
               <a:graphicData uri="http://schemas.openxmlformats.org/drawingml/2006/picture">
                 <pic:pic xmlns:pic="http://schemas.openxmlformats.org/drawingml/2006/picture">
                   <pic:nvPicPr>
-                    <pic:cNvPr id="1641390364" name="Picture 1" descr="A graph of a graph of a graph&#10;&#10;Description automatically generated with medium confidence"/>
+                    <pic:cNvPr id="841475619" name=""/>
                     <pic:cNvPicPr/>
                   </pic:nvPicPr>
                   <pic:blipFill>
@@ -5790,49 +5909,6 @@
     </w:p>
     <w:p>
       <w:pPr>
-        <w:spacing w:line="278" w:lineRule="auto"/>
-        <w:jc w:val="left"/>
-        <w:rPr>
-          <w:lang w:val="en-US"/>
-        </w:rPr>
-      </w:pPr>
-      <w:r>
-        <w:rPr>
-          <w:lang w:val="en-US"/>
-        </w:rPr>
-        <w:br w:type="page"/>
-      </w:r>
-    </w:p>
-    <w:p>
-      <w:pPr>
-        <w:pStyle w:val="Heading2"/>
-        <w:rPr>
-          <w:lang w:val="en-US"/>
-        </w:rPr>
-      </w:pPr>
-      <w:r>
-        <w:rPr>
-          <w:lang w:val="en-US"/>
-        </w:rPr>
-        <w:t>Domain resolution sensitivity</w:t>
-      </w:r>
-    </w:p>
-    <w:p>
-      <w:pPr>
-        <w:pStyle w:val="Heading3"/>
-        <w:rPr>
-          <w:lang w:val="en-US"/>
-        </w:rPr>
-      </w:pPr>
-      <w:r>
-        <w:rPr>
-          <w:lang w:val="en-US"/>
-        </w:rPr>
-        <w:t>NX = 20, NY = 20</w:t>
-      </w:r>
-    </w:p>
-    <w:p>
-      <w:pPr>
         <w:jc w:val="center"/>
         <w:rPr>
           <w:lang w:val="en-US"/>
@@ -5840,13 +5916,15 @@
       </w:pPr>
       <w:r>
         <w:rPr>
-          <w:lang w:val="en-US"/>
-        </w:rPr>
+          <w:noProof/>
+          <w:lang w:val="en-US"/>
+        </w:rPr>
+        <w:lastRenderedPageBreak/>
         <w:drawing>
-          <wp:inline distT="0" distB="0" distL="0" distR="0" wp14:anchorId="3813213A" wp14:editId="160A725C">
+          <wp:inline distT="0" distB="0" distL="0" distR="0" wp14:anchorId="22C60A54" wp14:editId="4264BD04">
             <wp:extent cx="8863330" cy="4670425"/>
             <wp:effectExtent l="0" t="0" r="0" b="0"/>
-            <wp:docPr id="1973881826" name="Picture 1"/>
+            <wp:docPr id="1641390364" name="Picture 1" descr="A graph of a graph of a graph&#10;&#10;Description automatically generated with medium confidence"/>
             <wp:cNvGraphicFramePr>
               <a:graphicFrameLocks xmlns:a="http://schemas.openxmlformats.org/drawingml/2006/main" noChangeAspect="1"/>
             </wp:cNvGraphicFramePr>
@@ -5854,7 +5932,7 @@
               <a:graphicData uri="http://schemas.openxmlformats.org/drawingml/2006/picture">
                 <pic:pic xmlns:pic="http://schemas.openxmlformats.org/drawingml/2006/picture">
                   <pic:nvPicPr>
-                    <pic:cNvPr id="1973881826" name=""/>
+                    <pic:cNvPr id="1641390364" name="Picture 1" descr="A graph of a graph of a graph&#10;&#10;Description automatically generated with medium confidence"/>
                     <pic:cNvPicPr/>
                   </pic:nvPicPr>
                   <pic:blipFill>
@@ -5881,6 +5959,50 @@
     </w:p>
     <w:p>
       <w:pPr>
+        <w:spacing w:line="278" w:lineRule="auto"/>
+        <w:jc w:val="left"/>
+        <w:rPr>
+          <w:lang w:val="en-US"/>
+        </w:rPr>
+      </w:pPr>
+      <w:r>
+        <w:rPr>
+          <w:lang w:val="en-US"/>
+        </w:rPr>
+        <w:br w:type="page"/>
+      </w:r>
+    </w:p>
+    <w:p>
+      <w:pPr>
+        <w:pStyle w:val="Heading2"/>
+        <w:rPr>
+          <w:lang w:val="en-US"/>
+        </w:rPr>
+      </w:pPr>
+      <w:r>
+        <w:rPr>
+          <w:lang w:val="en-US"/>
+        </w:rPr>
+        <w:lastRenderedPageBreak/>
+        <w:t>Domain resolution sensitivity</w:t>
+      </w:r>
+    </w:p>
+    <w:p>
+      <w:pPr>
+        <w:pStyle w:val="Heading3"/>
+        <w:rPr>
+          <w:lang w:val="en-US"/>
+        </w:rPr>
+      </w:pPr>
+      <w:r>
+        <w:rPr>
+          <w:lang w:val="en-US"/>
+        </w:rPr>
+        <w:t>NX = 20, NY = 20</w:t>
+      </w:r>
+    </w:p>
+    <w:p>
+      <w:pPr>
         <w:jc w:val="center"/>
         <w:rPr>
           <w:lang w:val="en-US"/>
@@ -5888,13 +6010,14 @@
       </w:pPr>
       <w:r>
         <w:rPr>
+          <w:noProof/>
           <w:lang w:val="en-US"/>
         </w:rPr>
         <w:drawing>
-          <wp:inline distT="0" distB="0" distL="0" distR="0" wp14:anchorId="71F651DD" wp14:editId="053E40DC">
+          <wp:inline distT="0" distB="0" distL="0" distR="0" wp14:anchorId="3813213A" wp14:editId="160A725C">
             <wp:extent cx="8863330" cy="4670425"/>
             <wp:effectExtent l="0" t="0" r="0" b="0"/>
-            <wp:docPr id="1189356736" name="Picture 1" descr="A graph of a graph of a graph&#10;&#10;Description automatically generated with medium confidence"/>
+            <wp:docPr id="1973881826" name="Picture 1"/>
             <wp:cNvGraphicFramePr>
               <a:graphicFrameLocks xmlns:a="http://schemas.openxmlformats.org/drawingml/2006/main" noChangeAspect="1"/>
             </wp:cNvGraphicFramePr>
@@ -5902,7 +6025,7 @@
               <a:graphicData uri="http://schemas.openxmlformats.org/drawingml/2006/picture">
                 <pic:pic xmlns:pic="http://schemas.openxmlformats.org/drawingml/2006/picture">
                   <pic:nvPicPr>
-                    <pic:cNvPr id="1189356736" name="Picture 1" descr="A graph of a graph of a graph&#10;&#10;Description automatically generated with medium confidence"/>
+                    <pic:cNvPr id="1973881826" name=""/>
                     <pic:cNvPicPr/>
                   </pic:nvPicPr>
                   <pic:blipFill>
@@ -5929,43 +6052,6 @@
     </w:p>
     <w:p>
       <w:pPr>
-        <w:spacing w:line="278" w:lineRule="auto"/>
-        <w:jc w:val="left"/>
-        <w:rPr>
-          <w:lang w:val="en-US"/>
-        </w:rPr>
-      </w:pPr>
-      <w:r>
-        <w:rPr>
-          <w:lang w:val="en-US"/>
-        </w:rPr>
-        <w:br w:type="page"/>
-      </w:r>
-    </w:p>
-    <w:p>
-      <w:pPr>
-        <w:pStyle w:val="Heading3"/>
-        <w:rPr>
-          <w:lang w:val="en-US"/>
-        </w:rPr>
-      </w:pPr>
-      <w:proofErr w:type="spellStart"/>
-      <w:r>
-        <w:rPr>
-          <w:lang w:val="en-US"/>
-        </w:rPr>
-        <w:t>Nx</w:t>
-      </w:r>
-      <w:proofErr w:type="spellEnd"/>
-      <w:r>
-        <w:rPr>
-          <w:lang w:val="en-US"/>
-        </w:rPr>
-        <w:t xml:space="preserve"> = 30, Ny = 30</w:t>
-      </w:r>
-    </w:p>
-    <w:p>
-      <w:pPr>
         <w:jc w:val="center"/>
         <w:rPr>
           <w:lang w:val="en-US"/>
@@ -5973,13 +6059,15 @@
       </w:pPr>
       <w:r>
         <w:rPr>
-          <w:lang w:val="en-US"/>
-        </w:rPr>
+          <w:noProof/>
+          <w:lang w:val="en-US"/>
+        </w:rPr>
+        <w:lastRenderedPageBreak/>
         <w:drawing>
-          <wp:inline distT="0" distB="0" distL="0" distR="0" wp14:anchorId="2F31B45D" wp14:editId="218DBC65">
+          <wp:inline distT="0" distB="0" distL="0" distR="0" wp14:anchorId="71F651DD" wp14:editId="053E40DC">
             <wp:extent cx="8863330" cy="4670425"/>
             <wp:effectExtent l="0" t="0" r="0" b="0"/>
-            <wp:docPr id="2146760607" name="Picture 1" descr="A group of graphs showing different colors&#10;&#10;Description automatically generated with medium confidence"/>
+            <wp:docPr id="1189356736" name="Picture 1" descr="A graph of a graph of a graph&#10;&#10;Description automatically generated with medium confidence"/>
             <wp:cNvGraphicFramePr>
               <a:graphicFrameLocks xmlns:a="http://schemas.openxmlformats.org/drawingml/2006/main" noChangeAspect="1"/>
             </wp:cNvGraphicFramePr>
@@ -5987,7 +6075,7 @@
               <a:graphicData uri="http://schemas.openxmlformats.org/drawingml/2006/picture">
                 <pic:pic xmlns:pic="http://schemas.openxmlformats.org/drawingml/2006/picture">
                   <pic:nvPicPr>
-                    <pic:cNvPr id="2146760607" name="Picture 1" descr="A group of graphs showing different colors&#10;&#10;Description automatically generated with medium confidence"/>
+                    <pic:cNvPr id="1189356736" name="Picture 1" descr="A graph of a graph of a graph&#10;&#10;Description automatically generated with medium confidence"/>
                     <pic:cNvPicPr/>
                   </pic:nvPicPr>
                   <pic:blipFill>
@@ -6014,6 +6102,44 @@
     </w:p>
     <w:p>
       <w:pPr>
+        <w:spacing w:line="278" w:lineRule="auto"/>
+        <w:jc w:val="left"/>
+        <w:rPr>
+          <w:lang w:val="en-US"/>
+        </w:rPr>
+      </w:pPr>
+      <w:r>
+        <w:rPr>
+          <w:lang w:val="en-US"/>
+        </w:rPr>
+        <w:br w:type="page"/>
+      </w:r>
+    </w:p>
+    <w:p>
+      <w:pPr>
+        <w:pStyle w:val="Heading3"/>
+        <w:rPr>
+          <w:lang w:val="en-US"/>
+        </w:rPr>
+      </w:pPr>
+      <w:proofErr w:type="spellStart"/>
+      <w:r>
+        <w:rPr>
+          <w:lang w:val="en-US"/>
+        </w:rPr>
+        <w:lastRenderedPageBreak/>
+        <w:t>Nx</w:t>
+      </w:r>
+      <w:proofErr w:type="spellEnd"/>
+      <w:r>
+        <w:rPr>
+          <w:lang w:val="en-US"/>
+        </w:rPr>
+        <w:t xml:space="preserve"> = 30, Ny = 30</w:t>
+      </w:r>
+    </w:p>
+    <w:p>
+      <w:pPr>
         <w:jc w:val="center"/>
         <w:rPr>
           <w:lang w:val="en-US"/>
@@ -6021,13 +6147,14 @@
       </w:pPr>
       <w:r>
         <w:rPr>
+          <w:noProof/>
           <w:lang w:val="en-US"/>
         </w:rPr>
         <w:drawing>
-          <wp:inline distT="0" distB="0" distL="0" distR="0" wp14:anchorId="4E2CBA4A" wp14:editId="24950EDE">
+          <wp:inline distT="0" distB="0" distL="0" distR="0" wp14:anchorId="2F31B45D" wp14:editId="218DBC65">
             <wp:extent cx="8863330" cy="4670425"/>
             <wp:effectExtent l="0" t="0" r="0" b="0"/>
-            <wp:docPr id="183984478" name="Picture 1" descr="A rainbow colored graph on a white background&#10;&#10;Description automatically generated"/>
+            <wp:docPr id="2146760607" name="Picture 1" descr="A group of graphs showing different colors&#10;&#10;Description automatically generated with medium confidence"/>
             <wp:cNvGraphicFramePr>
               <a:graphicFrameLocks xmlns:a="http://schemas.openxmlformats.org/drawingml/2006/main" noChangeAspect="1"/>
             </wp:cNvGraphicFramePr>
@@ -6035,7 +6162,7 @@
               <a:graphicData uri="http://schemas.openxmlformats.org/drawingml/2006/picture">
                 <pic:pic xmlns:pic="http://schemas.openxmlformats.org/drawingml/2006/picture">
                   <pic:nvPicPr>
-                    <pic:cNvPr id="183984478" name="Picture 1" descr="A rainbow colored graph on a white background&#10;&#10;Description automatically generated"/>
+                    <pic:cNvPr id="2146760607" name="Picture 1" descr="A group of graphs showing different colors&#10;&#10;Description automatically generated with medium confidence"/>
                     <pic:cNvPicPr/>
                   </pic:nvPicPr>
                   <pic:blipFill>
@@ -6062,43 +6189,6 @@
     </w:p>
     <w:p>
       <w:pPr>
-        <w:spacing w:line="278" w:lineRule="auto"/>
-        <w:jc w:val="left"/>
-        <w:rPr>
-          <w:lang w:val="en-US"/>
-        </w:rPr>
-      </w:pPr>
-      <w:r>
-        <w:rPr>
-          <w:lang w:val="en-US"/>
-        </w:rPr>
-        <w:br w:type="page"/>
-      </w:r>
-    </w:p>
-    <w:p>
-      <w:pPr>
-        <w:pStyle w:val="Heading3"/>
-        <w:rPr>
-          <w:lang w:val="en-US"/>
-        </w:rPr>
-      </w:pPr>
-      <w:proofErr w:type="spellStart"/>
-      <w:r>
-        <w:rPr>
-          <w:lang w:val="en-US"/>
-        </w:rPr>
-        <w:t>Nx</w:t>
-      </w:r>
-      <w:proofErr w:type="spellEnd"/>
-      <w:r>
-        <w:rPr>
-          <w:lang w:val="en-US"/>
-        </w:rPr>
-        <w:t xml:space="preserve"> = 40, Ny = 40</w:t>
-      </w:r>
-    </w:p>
-    <w:p>
-      <w:pPr>
         <w:jc w:val="center"/>
         <w:rPr>
           <w:lang w:val="en-US"/>
@@ -6106,13 +6196,15 @@
       </w:pPr>
       <w:r>
         <w:rPr>
-          <w:lang w:val="en-US"/>
-        </w:rPr>
+          <w:noProof/>
+          <w:lang w:val="en-US"/>
+        </w:rPr>
+        <w:lastRenderedPageBreak/>
         <w:drawing>
-          <wp:inline distT="0" distB="0" distL="0" distR="0" wp14:anchorId="420FC5F4" wp14:editId="7C7D7F94">
+          <wp:inline distT="0" distB="0" distL="0" distR="0" wp14:anchorId="4E2CBA4A" wp14:editId="24950EDE">
             <wp:extent cx="8863330" cy="4670425"/>
             <wp:effectExtent l="0" t="0" r="0" b="0"/>
-            <wp:docPr id="838104118" name="Picture 1" descr="A group of colorful graphs&#10;&#10;Description automatically generated with medium confidence"/>
+            <wp:docPr id="183984478" name="Picture 1" descr="A rainbow colored graph on a white background&#10;&#10;Description automatically generated"/>
             <wp:cNvGraphicFramePr>
               <a:graphicFrameLocks xmlns:a="http://schemas.openxmlformats.org/drawingml/2006/main" noChangeAspect="1"/>
             </wp:cNvGraphicFramePr>
@@ -6120,7 +6212,7 @@
               <a:graphicData uri="http://schemas.openxmlformats.org/drawingml/2006/picture">
                 <pic:pic xmlns:pic="http://schemas.openxmlformats.org/drawingml/2006/picture">
                   <pic:nvPicPr>
-                    <pic:cNvPr id="838104118" name="Picture 1" descr="A group of colorful graphs&#10;&#10;Description automatically generated with medium confidence"/>
+                    <pic:cNvPr id="183984478" name="Picture 1" descr="A rainbow colored graph on a white background&#10;&#10;Description automatically generated"/>
                     <pic:cNvPicPr/>
                   </pic:nvPicPr>
                   <pic:blipFill>
@@ -6147,6 +6239,44 @@
     </w:p>
     <w:p>
       <w:pPr>
+        <w:spacing w:line="278" w:lineRule="auto"/>
+        <w:jc w:val="left"/>
+        <w:rPr>
+          <w:lang w:val="en-US"/>
+        </w:rPr>
+      </w:pPr>
+      <w:r>
+        <w:rPr>
+          <w:lang w:val="en-US"/>
+        </w:rPr>
+        <w:br w:type="page"/>
+      </w:r>
+    </w:p>
+    <w:p>
+      <w:pPr>
+        <w:pStyle w:val="Heading3"/>
+        <w:rPr>
+          <w:lang w:val="en-US"/>
+        </w:rPr>
+      </w:pPr>
+      <w:proofErr w:type="spellStart"/>
+      <w:r>
+        <w:rPr>
+          <w:lang w:val="en-US"/>
+        </w:rPr>
+        <w:lastRenderedPageBreak/>
+        <w:t>Nx</w:t>
+      </w:r>
+      <w:proofErr w:type="spellEnd"/>
+      <w:r>
+        <w:rPr>
+          <w:lang w:val="en-US"/>
+        </w:rPr>
+        <w:t xml:space="preserve"> = 40, Ny = 40</w:t>
+      </w:r>
+    </w:p>
+    <w:p>
+      <w:pPr>
         <w:jc w:val="center"/>
         <w:rPr>
           <w:lang w:val="en-US"/>
@@ -6154,13 +6284,14 @@
       </w:pPr>
       <w:r>
         <w:rPr>
+          <w:noProof/>
           <w:lang w:val="en-US"/>
         </w:rPr>
         <w:drawing>
-          <wp:inline distT="0" distB="0" distL="0" distR="0" wp14:anchorId="3B5D2A50" wp14:editId="7109ED72">
+          <wp:inline distT="0" distB="0" distL="0" distR="0" wp14:anchorId="420FC5F4" wp14:editId="7C7D7F94">
             <wp:extent cx="8863330" cy="4670425"/>
             <wp:effectExtent l="0" t="0" r="0" b="0"/>
-            <wp:docPr id="938699940" name="Picture 1" descr="A graph of a graph of a graph&#10;&#10;Description automatically generated with medium confidence"/>
+            <wp:docPr id="838104118" name="Picture 1" descr="A group of colorful graphs&#10;&#10;Description automatically generated with medium confidence"/>
             <wp:cNvGraphicFramePr>
               <a:graphicFrameLocks xmlns:a="http://schemas.openxmlformats.org/drawingml/2006/main" noChangeAspect="1"/>
             </wp:cNvGraphicFramePr>
@@ -6168,7 +6299,7 @@
               <a:graphicData uri="http://schemas.openxmlformats.org/drawingml/2006/picture">
                 <pic:pic xmlns:pic="http://schemas.openxmlformats.org/drawingml/2006/picture">
                   <pic:nvPicPr>
-                    <pic:cNvPr id="938699940" name="Picture 1" descr="A graph of a graph of a graph&#10;&#10;Description automatically generated with medium confidence"/>
+                    <pic:cNvPr id="838104118" name="Picture 1" descr="A group of colorful graphs&#10;&#10;Description automatically generated with medium confidence"/>
                     <pic:cNvPicPr/>
                   </pic:nvPicPr>
                   <pic:blipFill>
@@ -6195,55 +6326,6 @@
     </w:p>
     <w:p>
       <w:pPr>
-        <w:spacing w:line="278" w:lineRule="auto"/>
-        <w:jc w:val="left"/>
-        <w:rPr>
-          <w:lang w:val="en-US"/>
-        </w:rPr>
-      </w:pPr>
-      <w:r>
-        <w:rPr>
-          <w:lang w:val="en-US"/>
-        </w:rPr>
-        <w:br w:type="page"/>
-      </w:r>
-    </w:p>
-    <w:p>
-      <w:pPr>
-        <w:pStyle w:val="Heading3"/>
-        <w:rPr>
-          <w:lang w:val="en-US"/>
-        </w:rPr>
-      </w:pPr>
-      <w:proofErr w:type="spellStart"/>
-      <w:r>
-        <w:rPr>
-          <w:lang w:val="en-US"/>
-        </w:rPr>
-        <w:t>Nx</w:t>
-      </w:r>
-      <w:proofErr w:type="spellEnd"/>
-      <w:r>
-        <w:rPr>
-          <w:lang w:val="en-US"/>
-        </w:rPr>
-        <w:t xml:space="preserve"> = 50, Ny = </w:t>
-      </w:r>
-      <w:r>
-        <w:rPr>
-          <w:lang w:val="en-US"/>
-        </w:rPr>
-        <w:t>5</w:t>
-      </w:r>
-      <w:r>
-        <w:rPr>
-          <w:lang w:val="en-US"/>
-        </w:rPr>
-        <w:t>0</w:t>
-      </w:r>
-    </w:p>
-    <w:p>
-      <w:pPr>
         <w:jc w:val="center"/>
         <w:rPr>
           <w:lang w:val="en-US"/>
@@ -6251,13 +6333,15 @@
       </w:pPr>
       <w:r>
         <w:rPr>
-          <w:lang w:val="en-US"/>
-        </w:rPr>
+          <w:noProof/>
+          <w:lang w:val="en-US"/>
+        </w:rPr>
+        <w:lastRenderedPageBreak/>
         <w:drawing>
-          <wp:inline distT="0" distB="0" distL="0" distR="0" wp14:anchorId="52B1B4F3" wp14:editId="5CC37B77">
+          <wp:inline distT="0" distB="0" distL="0" distR="0" wp14:anchorId="3B5D2A50" wp14:editId="7109ED72">
             <wp:extent cx="8863330" cy="4670425"/>
             <wp:effectExtent l="0" t="0" r="0" b="0"/>
-            <wp:docPr id="1497089491" name="Picture 1"/>
+            <wp:docPr id="938699940" name="Picture 1" descr="A graph of a graph of a graph&#10;&#10;Description automatically generated with medium confidence"/>
             <wp:cNvGraphicFramePr>
               <a:graphicFrameLocks xmlns:a="http://schemas.openxmlformats.org/drawingml/2006/main" noChangeAspect="1"/>
             </wp:cNvGraphicFramePr>
@@ -6265,7 +6349,7 @@
               <a:graphicData uri="http://schemas.openxmlformats.org/drawingml/2006/picture">
                 <pic:pic xmlns:pic="http://schemas.openxmlformats.org/drawingml/2006/picture">
                   <pic:nvPicPr>
-                    <pic:cNvPr id="1497089491" name=""/>
+                    <pic:cNvPr id="938699940" name="Picture 1" descr="A graph of a graph of a graph&#10;&#10;Description automatically generated with medium confidence"/>
                     <pic:cNvPicPr/>
                   </pic:nvPicPr>
                   <pic:blipFill>
@@ -6292,6 +6376,56 @@
     </w:p>
     <w:p>
       <w:pPr>
+        <w:spacing w:line="278" w:lineRule="auto"/>
+        <w:jc w:val="left"/>
+        <w:rPr>
+          <w:lang w:val="en-US"/>
+        </w:rPr>
+      </w:pPr>
+      <w:r>
+        <w:rPr>
+          <w:lang w:val="en-US"/>
+        </w:rPr>
+        <w:br w:type="page"/>
+      </w:r>
+    </w:p>
+    <w:p>
+      <w:pPr>
+        <w:pStyle w:val="Heading3"/>
+        <w:rPr>
+          <w:lang w:val="en-US"/>
+        </w:rPr>
+      </w:pPr>
+      <w:proofErr w:type="spellStart"/>
+      <w:r>
+        <w:rPr>
+          <w:lang w:val="en-US"/>
+        </w:rPr>
+        <w:lastRenderedPageBreak/>
+        <w:t>Nx</w:t>
+      </w:r>
+      <w:proofErr w:type="spellEnd"/>
+      <w:r>
+        <w:rPr>
+          <w:lang w:val="en-US"/>
+        </w:rPr>
+        <w:t xml:space="preserve"> = 50, Ny = </w:t>
+      </w:r>
+      <w:r>
+        <w:rPr>
+          <w:lang w:val="en-US"/>
+        </w:rPr>
+        <w:t>5</w:t>
+      </w:r>
+      <w:r>
+        <w:rPr>
+          <w:lang w:val="en-US"/>
+        </w:rPr>
+        <w:t>0</w:t>
+      </w:r>
+    </w:p>
+    <w:p>
+      <w:pPr>
         <w:jc w:val="center"/>
         <w:rPr>
           <w:lang w:val="en-US"/>
@@ -6299,13 +6433,14 @@
       </w:pPr>
       <w:r>
         <w:rPr>
+          <w:noProof/>
           <w:lang w:val="en-US"/>
         </w:rPr>
         <w:drawing>
-          <wp:inline distT="0" distB="0" distL="0" distR="0" wp14:anchorId="6952E3DF" wp14:editId="0EF17D8F">
+          <wp:inline distT="0" distB="0" distL="0" distR="0" wp14:anchorId="52B1B4F3" wp14:editId="5CC37B77">
             <wp:extent cx="8863330" cy="4670425"/>
             <wp:effectExtent l="0" t="0" r="0" b="0"/>
-            <wp:docPr id="499257890" name="Picture 1" descr="A graph of a graph of a function&#10;&#10;Description automatically generated with medium confidence"/>
+            <wp:docPr id="1497089491" name="Picture 1"/>
             <wp:cNvGraphicFramePr>
               <a:graphicFrameLocks xmlns:a="http://schemas.openxmlformats.org/drawingml/2006/main" noChangeAspect="1"/>
             </wp:cNvGraphicFramePr>
@@ -6313,7 +6448,7 @@
               <a:graphicData uri="http://schemas.openxmlformats.org/drawingml/2006/picture">
                 <pic:pic xmlns:pic="http://schemas.openxmlformats.org/drawingml/2006/picture">
                   <pic:nvPicPr>
-                    <pic:cNvPr id="499257890" name="Picture 1" descr="A graph of a graph of a function&#10;&#10;Description automatically generated with medium confidence"/>
+                    <pic:cNvPr id="1497089491" name=""/>
                     <pic:cNvPicPr/>
                   </pic:nvPicPr>
                   <pic:blipFill>
@@ -6345,123 +6480,17 @@
           <w:lang w:val="en-US"/>
         </w:rPr>
       </w:pPr>
-    </w:p>
-    <w:p>
-      <w:pPr>
-        <w:spacing w:line="278" w:lineRule="auto"/>
-        <w:jc w:val="left"/>
-        <w:rPr>
-          <w:lang w:val="en-US"/>
-        </w:rPr>
-      </w:pPr>
-      <w:r>
-        <w:rPr>
-          <w:lang w:val="en-US"/>
-        </w:rPr>
-        <w:br w:type="page"/>
-      </w:r>
-    </w:p>
-    <w:p>
-      <w:pPr>
-        <w:pStyle w:val="Heading2"/>
-        <w:rPr>
-          <w:lang w:val="en-US"/>
-        </w:rPr>
-      </w:pPr>
-      <w:r>
-        <w:rPr>
-          <w:lang w:val="en-US"/>
-        </w:rPr>
-        <w:t xml:space="preserve">Wall boundary conditions </w:t>
-      </w:r>
-      <w:r>
-        <w:rPr>
-          <w:lang w:val="en-US"/>
-        </w:rPr>
-        <w:t>sensitivity</w:t>
-      </w:r>
-    </w:p>
-    <w:p>
-      <w:pPr>
-        <w:pStyle w:val="Heading3"/>
-        <w:rPr>
-          <w:lang w:val="en-US"/>
-        </w:rPr>
-      </w:pPr>
-      <w:r>
-        <w:rPr>
-          <w:lang w:val="en-US"/>
-        </w:rPr>
-        <w:t xml:space="preserve">Pressure compatibility </w:t>
-      </w:r>
-      <w:proofErr w:type="gramStart"/>
-      <w:r>
-        <w:rPr>
-          <w:lang w:val="en-US"/>
-        </w:rPr>
-        <w:t>conditions</w:t>
-      </w:r>
-      <w:proofErr w:type="gramEnd"/>
-    </w:p>
-    <w:p>
-      <w:pPr>
-        <w:rPr>
-          <w:lang w:val="en-US"/>
-        </w:rPr>
-      </w:pPr>
-    </w:p>
-    <w:p>
-      <w:pPr>
-        <w:rPr>
-          <w:lang w:val="en-US"/>
-        </w:rPr>
-      </w:pPr>
-    </w:p>
-    <w:p>
-      <w:pPr>
-        <w:spacing w:line="278" w:lineRule="auto"/>
-        <w:jc w:val="left"/>
-        <w:rPr>
-          <w:lang w:val="en-US"/>
-        </w:rPr>
-      </w:pPr>
-      <w:r>
-        <w:rPr>
-          <w:lang w:val="en-US"/>
-        </w:rPr>
-        <w:br w:type="page"/>
-      </w:r>
-    </w:p>
-    <w:p>
-      <w:pPr>
-        <w:pStyle w:val="Heading3"/>
-        <w:rPr>
-          <w:lang w:val="en-US"/>
-        </w:rPr>
-      </w:pPr>
-      <w:r>
-        <w:rPr>
-          <w:lang w:val="en-US"/>
-        </w:rPr>
-        <w:t>Linearized pressure Poisson equation</w:t>
-      </w:r>
-    </w:p>
-    <w:p>
-      <w:pPr>
-        <w:jc w:val="center"/>
-        <w:rPr>
-          <w:lang w:val="en-US"/>
-        </w:rPr>
-      </w:pPr>
-      <w:r>
-        <w:rPr>
-          <w:lang w:val="en-US"/>
-        </w:rPr>
+      <w:r>
+        <w:rPr>
+          <w:noProof/>
+          <w:lang w:val="en-US"/>
+        </w:rPr>
+        <w:lastRenderedPageBreak/>
         <w:drawing>
-          <wp:inline distT="0" distB="0" distL="0" distR="0" wp14:anchorId="6EB50530" wp14:editId="03FEC86E">
+          <wp:inline distT="0" distB="0" distL="0" distR="0" wp14:anchorId="6952E3DF" wp14:editId="0EF17D8F">
             <wp:extent cx="8863330" cy="4670425"/>
             <wp:effectExtent l="0" t="0" r="0" b="0"/>
-            <wp:docPr id="1225931122" name="Picture 1"/>
+            <wp:docPr id="499257890" name="Picture 1" descr="A graph of a graph of a function&#10;&#10;Description automatically generated with medium confidence"/>
             <wp:cNvGraphicFramePr>
               <a:graphicFrameLocks xmlns:a="http://schemas.openxmlformats.org/drawingml/2006/main" noChangeAspect="1"/>
             </wp:cNvGraphicFramePr>
@@ -6469,11 +6498,11 @@
               <a:graphicData uri="http://schemas.openxmlformats.org/drawingml/2006/picture">
                 <pic:pic xmlns:pic="http://schemas.openxmlformats.org/drawingml/2006/picture">
                   <pic:nvPicPr>
-                    <pic:cNvPr id="532575160" name=""/>
+                    <pic:cNvPr id="499257890" name="Picture 1" descr="A graph of a graph of a function&#10;&#10;Description automatically generated with medium confidence"/>
                     <pic:cNvPicPr/>
                   </pic:nvPicPr>
                   <pic:blipFill>
-                    <a:blip r:embed="rId48"/>
+                    <a:blip r:embed="rId62"/>
                     <a:stretch>
                       <a:fillRect/>
                     </a:stretch>
@@ -6501,15 +6530,118 @@
           <w:lang w:val="en-US"/>
         </w:rPr>
       </w:pPr>
-      <w:r>
-        <w:rPr>
+    </w:p>
+    <w:p>
+      <w:pPr>
+        <w:spacing w:line="278" w:lineRule="auto"/>
+        <w:jc w:val="left"/>
+        <w:rPr>
+          <w:lang w:val="en-US"/>
+        </w:rPr>
+      </w:pPr>
+      <w:r>
+        <w:rPr>
+          <w:lang w:val="en-US"/>
+        </w:rPr>
+        <w:br w:type="page"/>
+      </w:r>
+    </w:p>
+    <w:p>
+      <w:pPr>
+        <w:pStyle w:val="Heading2"/>
+        <w:rPr>
+          <w:lang w:val="en-US"/>
+        </w:rPr>
+      </w:pPr>
+      <w:r>
+        <w:rPr>
+          <w:lang w:val="en-US"/>
+        </w:rPr>
+        <w:lastRenderedPageBreak/>
+        <w:t xml:space="preserve">Wall boundary conditions </w:t>
+      </w:r>
+      <w:r>
+        <w:rPr>
+          <w:lang w:val="en-US"/>
+        </w:rPr>
+        <w:t>sensitivity</w:t>
+      </w:r>
+    </w:p>
+    <w:p>
+      <w:pPr>
+        <w:pStyle w:val="Heading3"/>
+        <w:rPr>
+          <w:lang w:val="en-US"/>
+        </w:rPr>
+      </w:pPr>
+      <w:r>
+        <w:rPr>
+          <w:lang w:val="en-US"/>
+        </w:rPr>
+        <w:t>Pressure compatibility conditions</w:t>
+      </w:r>
+    </w:p>
+    <w:p>
+      <w:pPr>
+        <w:rPr>
+          <w:lang w:val="en-US"/>
+        </w:rPr>
+      </w:pPr>
+    </w:p>
+    <w:p>
+      <w:pPr>
+        <w:rPr>
+          <w:lang w:val="en-US"/>
+        </w:rPr>
+      </w:pPr>
+    </w:p>
+    <w:p>
+      <w:pPr>
+        <w:spacing w:line="278" w:lineRule="auto"/>
+        <w:jc w:val="left"/>
+        <w:rPr>
+          <w:lang w:val="en-US"/>
+        </w:rPr>
+      </w:pPr>
+      <w:r>
+        <w:rPr>
+          <w:lang w:val="en-US"/>
+        </w:rPr>
+        <w:br w:type="page"/>
+      </w:r>
+    </w:p>
+    <w:p>
+      <w:pPr>
+        <w:pStyle w:val="Heading3"/>
+        <w:rPr>
+          <w:lang w:val="en-US"/>
+        </w:rPr>
+      </w:pPr>
+      <w:r>
+        <w:rPr>
+          <w:lang w:val="en-US"/>
+        </w:rPr>
+        <w:lastRenderedPageBreak/>
+        <w:t>Linearized pressure Poisson equation</w:t>
+      </w:r>
+    </w:p>
+    <w:p>
+      <w:pPr>
+        <w:jc w:val="center"/>
+        <w:rPr>
+          <w:lang w:val="en-US"/>
+        </w:rPr>
+      </w:pPr>
+      <w:r>
+        <w:rPr>
+          <w:noProof/>
           <w:lang w:val="en-US"/>
         </w:rPr>
         <w:drawing>
-          <wp:inline distT="0" distB="0" distL="0" distR="0" wp14:anchorId="10B16C67" wp14:editId="5D844039">
+          <wp:inline distT="0" distB="0" distL="0" distR="0" wp14:anchorId="6EB50530" wp14:editId="03FEC86E">
             <wp:extent cx="8863330" cy="4670425"/>
             <wp:effectExtent l="0" t="0" r="0" b="0"/>
-            <wp:docPr id="1223546093" name="Picture 1" descr="A graph of a graph of a graph&#10;&#10;Description automatically generated with medium confidence"/>
+            <wp:docPr id="1225931122" name="Picture 1"/>
             <wp:cNvGraphicFramePr>
               <a:graphicFrameLocks xmlns:a="http://schemas.openxmlformats.org/drawingml/2006/main" noChangeAspect="1"/>
             </wp:cNvGraphicFramePr>
@@ -6517,7 +6649,7 @@
               <a:graphicData uri="http://schemas.openxmlformats.org/drawingml/2006/picture">
                 <pic:pic xmlns:pic="http://schemas.openxmlformats.org/drawingml/2006/picture">
                   <pic:nvPicPr>
-                    <pic:cNvPr id="49438670" name="Picture 1" descr="A graph of a graph of a graph&#10;&#10;Description automatically generated with medium confidence"/>
+                    <pic:cNvPr id="532575160" name=""/>
                     <pic:cNvPicPr/>
                   </pic:nvPicPr>
                   <pic:blipFill>
@@ -6544,61 +6676,6 @@
     </w:p>
     <w:p>
       <w:pPr>
-        <w:spacing w:line="278" w:lineRule="auto"/>
-        <w:jc w:val="left"/>
-        <w:rPr>
-          <w:lang w:val="en-US"/>
-        </w:rPr>
-      </w:pPr>
-      <w:r>
-        <w:rPr>
-          <w:lang w:val="en-US"/>
-        </w:rPr>
-        <w:br w:type="page"/>
-      </w:r>
-    </w:p>
-    <w:p>
-      <w:pPr>
-        <w:pStyle w:val="Heading2"/>
-        <w:rPr>
-          <w:lang w:val="en-US"/>
-        </w:rPr>
-      </w:pPr>
-      <w:r>
-        <w:rPr>
-          <w:lang w:val="en-US"/>
-        </w:rPr>
-        <w:t>Far-field boundary conditions</w:t>
-      </w:r>
-      <w:r>
-        <w:rPr>
-          <w:lang w:val="en-US"/>
-        </w:rPr>
-        <w:t xml:space="preserve"> </w:t>
-      </w:r>
-      <w:r>
-        <w:rPr>
-          <w:lang w:val="en-US"/>
-        </w:rPr>
-        <w:t>sensitivity</w:t>
-      </w:r>
-    </w:p>
-    <w:p>
-      <w:pPr>
-        <w:pStyle w:val="Heading3"/>
-        <w:rPr>
-          <w:lang w:val="en-US"/>
-        </w:rPr>
-      </w:pPr>
-      <w:r>
-        <w:rPr>
-          <w:lang w:val="en-US"/>
-        </w:rPr>
-        <w:t>p = 0</w:t>
-      </w:r>
-    </w:p>
-    <w:p>
-      <w:pPr>
         <w:jc w:val="center"/>
         <w:rPr>
           <w:lang w:val="en-US"/>
@@ -6606,13 +6683,15 @@
       </w:pPr>
       <w:r>
         <w:rPr>
-          <w:lang w:val="en-US"/>
-        </w:rPr>
+          <w:noProof/>
+          <w:lang w:val="en-US"/>
+        </w:rPr>
+        <w:lastRenderedPageBreak/>
         <w:drawing>
-          <wp:inline distT="0" distB="0" distL="0" distR="0" wp14:anchorId="7FEBADCD" wp14:editId="588A2480">
+          <wp:inline distT="0" distB="0" distL="0" distR="0" wp14:anchorId="10B16C67" wp14:editId="5D844039">
             <wp:extent cx="8863330" cy="4670425"/>
             <wp:effectExtent l="0" t="0" r="0" b="0"/>
-            <wp:docPr id="65219664" name="Picture 1"/>
+            <wp:docPr id="1223546093" name="Picture 1" descr="A graph of a graph of a graph&#10;&#10;Description automatically generated with medium confidence"/>
             <wp:cNvGraphicFramePr>
               <a:graphicFrameLocks xmlns:a="http://schemas.openxmlformats.org/drawingml/2006/main" noChangeAspect="1"/>
             </wp:cNvGraphicFramePr>
@@ -6620,11 +6699,11 @@
               <a:graphicData uri="http://schemas.openxmlformats.org/drawingml/2006/picture">
                 <pic:pic xmlns:pic="http://schemas.openxmlformats.org/drawingml/2006/picture">
                   <pic:nvPicPr>
-                    <pic:cNvPr id="65219664" name="Picture 1"/>
+                    <pic:cNvPr id="49438670" name="Picture 1" descr="A graph of a graph of a graph&#10;&#10;Description automatically generated with medium confidence"/>
                     <pic:cNvPicPr/>
                   </pic:nvPicPr>
                   <pic:blipFill>
-                    <a:blip r:embed="rId48"/>
+                    <a:blip r:embed="rId50"/>
                     <a:stretch>
                       <a:fillRect/>
                     </a:stretch>
@@ -6647,6 +6726,56 @@
     </w:p>
     <w:p>
       <w:pPr>
+        <w:spacing w:line="278" w:lineRule="auto"/>
+        <w:jc w:val="left"/>
+        <w:rPr>
+          <w:lang w:val="en-US"/>
+        </w:rPr>
+      </w:pPr>
+      <w:r>
+        <w:rPr>
+          <w:lang w:val="en-US"/>
+        </w:rPr>
+        <w:br w:type="page"/>
+      </w:r>
+    </w:p>
+    <w:p>
+      <w:pPr>
+        <w:pStyle w:val="Heading2"/>
+        <w:rPr>
+          <w:lang w:val="en-US"/>
+        </w:rPr>
+      </w:pPr>
+      <w:r>
+        <w:rPr>
+          <w:lang w:val="en-US"/>
+        </w:rPr>
+        <w:lastRenderedPageBreak/>
+        <w:t>Far-field boundary conditions</w:t>
+      </w:r>
+      <w:r>
+        <w:rPr>
+          <w:lang w:val="en-US"/>
+        </w:rPr>
+        <w:t xml:space="preserve"> sensitivity</w:t>
+      </w:r>
+    </w:p>
+    <w:p>
+      <w:pPr>
+        <w:pStyle w:val="Heading3"/>
+        <w:rPr>
+          <w:lang w:val="en-US"/>
+        </w:rPr>
+      </w:pPr>
+      <w:r>
+        <w:rPr>
+          <w:lang w:val="en-US"/>
+        </w:rPr>
+        <w:t>p = 0</w:t>
+      </w:r>
+    </w:p>
+    <w:p>
+      <w:pPr>
         <w:jc w:val="center"/>
         <w:rPr>
           <w:lang w:val="en-US"/>
@@ -6654,13 +6783,14 @@
       </w:pPr>
       <w:r>
         <w:rPr>
+          <w:noProof/>
           <w:lang w:val="en-US"/>
         </w:rPr>
         <w:drawing>
-          <wp:inline distT="0" distB="0" distL="0" distR="0" wp14:anchorId="7267AFCE" wp14:editId="6F39BACD">
+          <wp:inline distT="0" distB="0" distL="0" distR="0" wp14:anchorId="7FEBADCD" wp14:editId="588A2480">
             <wp:extent cx="8863330" cy="4670425"/>
             <wp:effectExtent l="0" t="0" r="0" b="0"/>
-            <wp:docPr id="1340823744" name="Picture 1" descr="A graph of a graph of a graph&#10;&#10;Description automatically generated with medium confidence"/>
+            <wp:docPr id="65219664" name="Picture 1"/>
             <wp:cNvGraphicFramePr>
               <a:graphicFrameLocks xmlns:a="http://schemas.openxmlformats.org/drawingml/2006/main" noChangeAspect="1"/>
             </wp:cNvGraphicFramePr>
@@ -6668,7 +6798,7 @@
               <a:graphicData uri="http://schemas.openxmlformats.org/drawingml/2006/picture">
                 <pic:pic xmlns:pic="http://schemas.openxmlformats.org/drawingml/2006/picture">
                   <pic:nvPicPr>
-                    <pic:cNvPr id="49438670" name="Picture 1" descr="A graph of a graph of a graph&#10;&#10;Description automatically generated with medium confidence"/>
+                    <pic:cNvPr id="65219664" name="Picture 1"/>
                     <pic:cNvPicPr/>
                   </pic:nvPicPr>
                   <pic:blipFill>
@@ -6695,6 +6825,56 @@
     </w:p>
     <w:p>
       <w:pPr>
+        <w:jc w:val="center"/>
+        <w:rPr>
+          <w:lang w:val="en-US"/>
+        </w:rPr>
+      </w:pPr>
+      <w:r>
+        <w:rPr>
+          <w:noProof/>
+          <w:lang w:val="en-US"/>
+        </w:rPr>
+        <w:lastRenderedPageBreak/>
+        <w:drawing>
+          <wp:inline distT="0" distB="0" distL="0" distR="0" wp14:anchorId="7267AFCE" wp14:editId="6F39BACD">
+            <wp:extent cx="8863330" cy="4670425"/>
+            <wp:effectExtent l="0" t="0" r="0" b="0"/>
+            <wp:docPr id="1340823744" name="Picture 1" descr="A graph of a graph of a graph&#10;&#10;Description automatically generated with medium confidence"/>
+            <wp:cNvGraphicFramePr>
+              <a:graphicFrameLocks xmlns:a="http://schemas.openxmlformats.org/drawingml/2006/main" noChangeAspect="1"/>
+            </wp:cNvGraphicFramePr>
+            <a:graphic xmlns:a="http://schemas.openxmlformats.org/drawingml/2006/main">
+              <a:graphicData uri="http://schemas.openxmlformats.org/drawingml/2006/picture">
+                <pic:pic xmlns:pic="http://schemas.openxmlformats.org/drawingml/2006/picture">
+                  <pic:nvPicPr>
+                    <pic:cNvPr id="49438670" name="Picture 1" descr="A graph of a graph of a graph&#10;&#10;Description automatically generated with medium confidence"/>
+                    <pic:cNvPicPr/>
+                  </pic:nvPicPr>
+                  <pic:blipFill>
+                    <a:blip r:embed="rId50"/>
+                    <a:stretch>
+                      <a:fillRect/>
+                    </a:stretch>
+                  </pic:blipFill>
+                  <pic:spPr>
+                    <a:xfrm>
+                      <a:off x="0" y="0"/>
+                      <a:ext cx="8863330" cy="4670425"/>
+                    </a:xfrm>
+                    <a:prstGeom prst="rect">
+                      <a:avLst/>
+                    </a:prstGeom>
+                  </pic:spPr>
+                </pic:pic>
+              </a:graphicData>
+            </a:graphic>
+          </wp:inline>
+        </w:drawing>
+      </w:r>
+    </w:p>
+    <w:p>
+      <w:pPr>
         <w:spacing w:line="278" w:lineRule="auto"/>
         <w:jc w:val="left"/>
         <w:rPr>
@@ -6719,6 +6899,7 @@
         <w:rPr>
           <w:lang w:val="en-US"/>
         </w:rPr>
+        <w:lastRenderedPageBreak/>
         <w:t>Linearized pressure Poisson equation</w:t>
       </w:r>
     </w:p>
@@ -6771,7 +6952,7 @@
 </file>
 
 <file path=word/numbering.xml><?xml version="1.0" encoding="utf-8"?>
-<w:numbering xmlns:wpc="http://schemas.microsoft.com/office/word/2010/wordprocessingCanvas" xmlns:cx="http://schemas.microsoft.com/office/drawing/2014/chartex" xmlns:cx1="http://schemas.microsoft.com/office/drawing/2015/9/8/chartex" xmlns:cx2="http://schemas.microsoft.com/office/drawing/2015/10/21/chartex" xmlns:cx3="http://schemas.microsoft.com/office/drawing/2016/5/9/chartex" xmlns:cx4="http://schemas.microsoft.com/office/drawing/2016/5/10/chartex" xmlns:cx5="http://schemas.microsoft.com/office/drawing/2016/5/11/chartex" xmlns:cx6="http://schemas.microsoft.com/office/drawing/2016/5/12/chartex" xmlns:cx7="http://schemas.microsoft.com/office/drawing/2016/5/13/chartex" xmlns:cx8="http://schemas.microsoft.com/office/drawing/2016/5/14/chartex" xmlns:mc="http://schemas.openxmlformats.org/markup-compatibility/2006" xmlns:aink="http://schemas.microsoft.com/office/drawing/2016/ink" xmlns:am3d="http://schemas.microsoft.com/office/drawing/2017/model3d" xmlns:o="urn:schemas-microsoft-com:office:office" xmlns:oel="http://schemas.microsoft.com/office/2019/extlst" xmlns:r="http://schemas.openxmlformats.org/officeDocument/2006/relationships" xmlns:m="http://schemas.openxmlformats.org/officeDocument/2006/math" xmlns:v="urn:schemas-microsoft-com:vml" xmlns:wp14="http://schemas.microsoft.com/office/word/2010/wordprocessingDrawing" xmlns:wp="http://schemas.openxmlformats.org/drawingml/2006/wordprocessingDrawing" xmlns:w10="urn:schemas-microsoft-com:office:word" xmlns:w="http://schemas.openxmlformats.org/wordprocessingml/2006/main" xmlns:w14="http://schemas.microsoft.com/office/word/2010/wordml" xmlns:w15="http://schemas.microsoft.com/office/word/2012/wordml" xmlns:w16cex="http://schemas.microsoft.com/office/word/2018/wordml/cex" xmlns:w16cid="http://schemas.microsoft.com/office/word/2016/wordml/cid" xmlns:w16="http://schemas.microsoft.com/office/word/2018/wordml" xmlns:w16du="http://schemas.microsoft.com/office/word/2023/wordml/word16du" xmlns:w16sdtdh="http://schemas.microsoft.com/office/word/2020/wordml/sdtdatahash" xmlns:w16se="http://schemas.microsoft.com/office/word/2015/wordml/symex" xmlns:wpg="http://schemas.microsoft.com/office/word/2010/wordprocessingGroup" xmlns:wpi="http://schemas.microsoft.com/office/word/2010/wordprocessingInk" xmlns:wne="http://schemas.microsoft.com/office/word/2006/wordml" xmlns:wps="http://schemas.microsoft.com/office/word/2010/wordprocessingShape" mc:Ignorable="w14 w15 w16se w16cid w16 w16cex w16sdtdh w16du wp14">
+<w:numbering xmlns:wpc="http://schemas.microsoft.com/office/word/2010/wordprocessingCanvas" xmlns:cx="http://schemas.microsoft.com/office/drawing/2014/chartex" xmlns:cx1="http://schemas.microsoft.com/office/drawing/2015/9/8/chartex" xmlns:cx2="http://schemas.microsoft.com/office/drawing/2015/10/21/chartex" xmlns:cx3="http://schemas.microsoft.com/office/drawing/2016/5/9/chartex" xmlns:cx4="http://schemas.microsoft.com/office/drawing/2016/5/10/chartex" xmlns:cx5="http://schemas.microsoft.com/office/drawing/2016/5/11/chartex" xmlns:cx6="http://schemas.microsoft.com/office/drawing/2016/5/12/chartex" xmlns:cx7="http://schemas.microsoft.com/office/drawing/2016/5/13/chartex" xmlns:cx8="http://schemas.microsoft.com/office/drawing/2016/5/14/chartex" xmlns:mc="http://schemas.openxmlformats.org/markup-compatibility/2006" xmlns:aink="http://schemas.microsoft.com/office/drawing/2016/ink" xmlns:am3d="http://schemas.microsoft.com/office/drawing/2017/model3d" xmlns:o="urn:schemas-microsoft-com:office:office" xmlns:oel="http://schemas.microsoft.com/office/2019/extlst" xmlns:r="http://schemas.openxmlformats.org/officeDocument/2006/relationships" xmlns:m="http://schemas.openxmlformats.org/officeDocument/2006/math" xmlns:v="urn:schemas-microsoft-com:vml" xmlns:wp14="http://schemas.microsoft.com/office/word/2010/wordprocessingDrawing" xmlns:wp="http://schemas.openxmlformats.org/drawingml/2006/wordprocessingDrawing" xmlns:w10="urn:schemas-microsoft-com:office:word" xmlns:w="http://schemas.openxmlformats.org/wordprocessingml/2006/main" xmlns:w14="http://schemas.microsoft.com/office/word/2010/wordml" xmlns:w15="http://schemas.microsoft.com/office/word/2012/wordml" xmlns:w16cex="http://schemas.microsoft.com/office/word/2018/wordml/cex" xmlns:w16cid="http://schemas.microsoft.com/office/word/2016/wordml/cid" xmlns:w16="http://schemas.microsoft.com/office/word/2018/wordml" xmlns:w16du="http://schemas.microsoft.com/office/word/2023/wordml/word16du" xmlns:w16sdtdh="http://schemas.microsoft.com/office/word/2020/wordml/sdtdatahash" xmlns:w16sdtfl="http://schemas.microsoft.com/office/word/2024/wordml/sdtformatlock" xmlns:w16se="http://schemas.microsoft.com/office/word/2015/wordml/symex" xmlns:wpg="http://schemas.microsoft.com/office/word/2010/wordprocessingGroup" xmlns:wpi="http://schemas.microsoft.com/office/word/2010/wordprocessingInk" xmlns:wne="http://schemas.microsoft.com/office/word/2006/wordml" xmlns:wps="http://schemas.microsoft.com/office/word/2010/wordprocessingShape" mc:Ignorable="w14 w15 w16se w16cid w16 w16cex w16sdtdh w16sdtfl w16du wp14">
   <w:abstractNum w:abstractNumId="0" w15:restartNumberingAfterBreak="0">
     <w:nsid w:val="4574373F"/>
     <w:multiLevelType w:val="multilevel"/>
@@ -6898,7 +7079,7 @@
 </file>
 
 <file path=word/styles.xml><?xml version="1.0" encoding="utf-8"?>
-<w:styles xmlns:mc="http://schemas.openxmlformats.org/markup-compatibility/2006" xmlns:r="http://schemas.openxmlformats.org/officeDocument/2006/relationships" xmlns:w="http://schemas.openxmlformats.org/wordprocessingml/2006/main" xmlns:w14="http://schemas.microsoft.com/office/word/2010/wordml" xmlns:w15="http://schemas.microsoft.com/office/word/2012/wordml" xmlns:w16cex="http://schemas.microsoft.com/office/word/2018/wordml/cex" xmlns:w16cid="http://schemas.microsoft.com/office/word/2016/wordml/cid" xmlns:w16="http://schemas.microsoft.com/office/word/2018/wordml" xmlns:w16du="http://schemas.microsoft.com/office/word/2023/wordml/word16du" xmlns:w16sdtdh="http://schemas.microsoft.com/office/word/2020/wordml/sdtdatahash" xmlns:w16se="http://schemas.microsoft.com/office/word/2015/wordml/symex" mc:Ignorable="w14 w15 w16se w16cid w16 w16cex w16sdtdh w16du">
+<w:styles xmlns:mc="http://schemas.openxmlformats.org/markup-compatibility/2006" xmlns:r="http://schemas.openxmlformats.org/officeDocument/2006/relationships" xmlns:w="http://schemas.openxmlformats.org/wordprocessingml/2006/main" xmlns:w14="http://schemas.microsoft.com/office/word/2010/wordml" xmlns:w15="http://schemas.microsoft.com/office/word/2012/wordml" xmlns:w16cex="http://schemas.microsoft.com/office/word/2018/wordml/cex" xmlns:w16cid="http://schemas.microsoft.com/office/word/2016/wordml/cid" xmlns:w16="http://schemas.microsoft.com/office/word/2018/wordml" xmlns:w16du="http://schemas.microsoft.com/office/word/2023/wordml/word16du" xmlns:w16sdtdh="http://schemas.microsoft.com/office/word/2020/wordml/sdtdatahash" xmlns:w16sdtfl="http://schemas.microsoft.com/office/word/2024/wordml/sdtformatlock" xmlns:w16se="http://schemas.microsoft.com/office/word/2015/wordml/symex" mc:Ignorable="w14 w15 w16se w16cid w16 w16cex w16sdtdh w16sdtfl w16du">
   <w:docDefaults>
     <w:rPrDefault>
       <w:rPr>
@@ -8185,4 +8366,16 @@
     </a:ext>
   </a:extLst>
 </a:theme>
+</file>
+
+<file path=customXml/item1.xml><?xml version="1.0" encoding="utf-8"?>
+<b:Sources xmlns:b="http://schemas.openxmlformats.org/officeDocument/2006/bibliography" xmlns="http://schemas.openxmlformats.org/officeDocument/2006/bibliography" SelectedStyle="\APASixthEditionOfficeOnline.xsl" StyleName="APA" Version="6"/>
+</file>
+
+<file path=customXml/itemProps1.xml><?xml version="1.0" encoding="utf-8"?>
+<ds:datastoreItem xmlns:ds="http://schemas.openxmlformats.org/officeDocument/2006/customXml" ds:itemID="{3D8B88CF-FD56-4158-ABC3-78519B164152}">
+  <ds:schemaRefs>
+    <ds:schemaRef ds:uri="http://schemas.openxmlformats.org/officeDocument/2006/bibliography"/>
+  </ds:schemaRefs>
+</ds:datastoreItem>
 </file>
</xml_diff>